<commit_message>
v1.4.4 - Add Iambic Mode A/B, fix header layout, update manuals
</commit_message>
<xml_diff>
--- a/docs/K0WLY_CW_Keyer_User_Guide.docx
+++ b/docs/K0WLY_CW_Keyer_User_Guide.docx
@@ -46,7 +46,7 @@
           <w:sz w:val="26"/>
           <w:szCs w:val="26"/>
         </w:rPr>
-        <w:t xml:space="preserve">Version 1.4.3</w:t>
+        <w:t xml:space="preserve">Version 1.4.4</w:t>
       </w:r>
     </w:p>
     <w:p>
@@ -90,7 +90,7 @@
           <w:sz w:val="22"/>
           <w:szCs w:val="22"/>
         </w:rPr>
-        <w:t xml:space="preserve">The K0WLY Two-Way CW Keyer is a Morse code practice and operating tool. It connects to your iambic paddle and provides:</w:t>
+        <w:t xml:space="preserve">The K0WLY Two-Way CW Keyer is a Morse code practice and operating tool. Connect your iambic paddle and get:</w:t>
       </w:r>
     </w:p>
     <w:p>
@@ -116,7 +116,7 @@
           <w:sz w:val="22"/>
           <w:szCs w:val="22"/>
         </w:rPr>
-        <w:t xml:space="preserve">A sidetone speaker so you can hear what you are sending</w:t>
+        <w:t xml:space="preserve">Sidetone speaker — hear what you send</w:t>
       </w:r>
     </w:p>
     <w:p>
@@ -134,7 +134,7 @@
           <w:sz w:val="22"/>
           <w:szCs w:val="22"/>
         </w:rPr>
-        <w:t xml:space="preserve">A scrolling display showing the characters you send</w:t>
+        <w:t xml:space="preserve">Scrolling display showing characters you send and receive</w:t>
       </w:r>
     </w:p>
     <w:p>
@@ -152,7 +152,7 @@
           <w:sz w:val="22"/>
           <w:szCs w:val="22"/>
         </w:rPr>
-        <w:t xml:space="preserve">Two-way practice — connect two units together and send CW back and forth wirelessly</w:t>
+        <w:t xml:space="preserve">Two-way practice — connect two units wirelessly</w:t>
       </w:r>
     </w:p>
     <w:p>
@@ -170,7 +170,7 @@
           <w:sz w:val="22"/>
           <w:szCs w:val="22"/>
         </w:rPr>
-        <w:t xml:space="preserve">Text file playback — load practice files from your phone and hear them in CW</w:t>
+        <w:t xml:space="preserve">Text file playback — load practice files from your phone</w:t>
       </w:r>
     </w:p>
     <w:p>
@@ -188,7 +188,7 @@
           <w:sz w:val="22"/>
           <w:szCs w:val="22"/>
         </w:rPr>
-        <w:t xml:space="preserve">Radio keying output — connect to your transceiver to actually transmit</w:t>
+        <w:t xml:space="preserve">Radio keying output — connect to your transceiver</w:t>
       </w:r>
     </w:p>
     <w:p>
@@ -206,28 +206,7 @@
           <w:sz w:val="22"/>
           <w:szCs w:val="22"/>
         </w:rPr>
-        <w:t xml:space="preserve">Iambic output — connect to a radio with a built-in keyer (e.g. Xiegu G90)</w:t>
-      </w:r>
-    </w:p>
-    <w:p>
-      <w:pPr>
-        <w:spacing w:after="120"/>
-      </w:pPr>
-      <w:r>
-        <w:t xml:space="preserve"/>
-      </w:r>
-    </w:p>
-    <w:p>
-      <w:pPr>
-        <w:spacing w:after="120"/>
-      </w:pPr>
-      <w:r>
-        <w:rPr>
-          <w:rFonts w:ascii="Arial" w:cs="Arial" w:eastAsia="Arial" w:hAnsi="Arial"/>
-          <w:sz w:val="22"/>
-          <w:szCs w:val="22"/>
-        </w:rPr>
-        <w:t xml:space="preserve">Everything is controlled from two buttons and a single knob on the unit, plus a web page on your phone.</w:t>
+        <w:t xml:space="preserve">Iambic Mode A or B — selectable via long press</w:t>
       </w:r>
     </w:p>
     <w:p>
@@ -252,27 +231,6 @@
           <w:szCs w:val="32"/>
         </w:rPr>
         <w:t xml:space="preserve">2. Understanding the Display</w:t>
-      </w:r>
-    </w:p>
-    <w:p>
-      <w:pPr>
-        <w:spacing w:after="120"/>
-      </w:pPr>
-      <w:r>
-        <w:rPr>
-          <w:rFonts w:ascii="Arial" w:cs="Arial" w:eastAsia="Arial" w:hAnsi="Arial"/>
-          <w:sz w:val="22"/>
-          <w:szCs w:val="22"/>
-        </w:rPr>
-        <w:t xml:space="preserve">The display is divided into four areas:</w:t>
-      </w:r>
-    </w:p>
-    <w:p>
-      <w:pPr>
-        <w:spacing w:after="120"/>
-      </w:pPr>
-      <w:r>
-        <w:t xml:space="preserve"/>
       </w:r>
     </w:p>
     <w:tbl>
@@ -383,7 +341,7 @@
                 <w:sz w:val="20"/>
                 <w:szCs w:val="20"/>
               </w:rPr>
-              <w:t xml:space="preserve">Header bar (top)</w:t>
+              <w:t xml:space="preserve">Header (top)</w:t>
             </w:r>
           </w:p>
         </w:tc>
@@ -414,7 +372,7 @@
                 <w:sz w:val="20"/>
                 <w:szCs w:val="20"/>
               </w:rPr>
-              <w:t xml:space="preserve">Speed, frequency, delay, volume, gap settings and operating mode</w:t>
+              <w:t xml:space="preserve">Speed, frequency, delay, volume, gap, mode, peer status</w:t>
             </w:r>
           </w:p>
         </w:tc>
@@ -478,7 +436,7 @@
                 <w:sz w:val="20"/>
                 <w:szCs w:val="20"/>
               </w:rPr>
-              <w:t xml:space="preserve">Characters you are sending or playing from a file</w:t>
+              <w:t xml:space="preserve">Characters you send or play from file</w:t>
             </w:r>
           </w:p>
         </w:tc>
@@ -542,7 +500,7 @@
                 <w:sz w:val="20"/>
                 <w:szCs w:val="20"/>
               </w:rPr>
-              <w:t xml:space="preserve">Characters received from the other unit</w:t>
+              <w:t xml:space="preserve">Characters received from other unit</w:t>
             </w:r>
           </w:p>
         </w:tc>
@@ -606,7 +564,7 @@
                 <w:sz w:val="20"/>
                 <w:szCs w:val="20"/>
               </w:rPr>
-              <w:t xml:space="preserve">Current setting being adjusted, peer unit info, your unit ID and version</w:t>
+              <w:t xml:space="preserve">Current setting, peer info, unit ID and version</w:t>
             </w:r>
           </w:p>
         </w:tc>
@@ -634,19 +592,6 @@
           <w:szCs w:val="26"/>
         </w:rPr>
         <w:t xml:space="preserve">2.1 Header Bar</w:t>
-      </w:r>
-    </w:p>
-    <w:p>
-      <w:pPr>
-        <w:spacing w:after="120"/>
-      </w:pPr>
-      <w:r>
-        <w:rPr>
-          <w:rFonts w:ascii="Arial" w:cs="Arial" w:eastAsia="Arial" w:hAnsi="Arial"/>
-          <w:sz w:val="22"/>
-          <w:szCs w:val="22"/>
-        </w:rPr>
-        <w:t xml:space="preserve">Reading left to right across the top:</w:t>
       </w:r>
     </w:p>
     <w:p>
@@ -664,7 +609,7 @@
           <w:sz w:val="22"/>
           <w:szCs w:val="22"/>
         </w:rPr>
-        <w:t xml:space="preserve">WPM or WPM/FARN — your sending speed. If Farnsworth is set, shows both (e.g. 25/10)</w:t>
+        <w:t xml:space="preserve">WPM or WPM/FARN — sending speed</w:t>
       </w:r>
     </w:p>
     <w:p>
@@ -682,7 +627,7 @@
           <w:sz w:val="22"/>
           <w:szCs w:val="22"/>
         </w:rPr>
-        <w:t xml:space="preserve">Hz — sidetone pitch in Hz</w:t>
+        <w:t xml:space="preserve">Hz — sidetone pitch</w:t>
       </w:r>
     </w:p>
     <w:p>
@@ -700,7 +645,7 @@
           <w:sz w:val="22"/>
           <w:szCs w:val="22"/>
         </w:rPr>
-        <w:t xml:space="preserve">DLY — head copy delay. DLY:0.0s means no delay. DLY:AO means Audio Only mode</w:t>
+        <w:t xml:space="preserve">DLY — head copy delay (0.0s = off, AO = Audio Only)</w:t>
       </w:r>
     </w:p>
     <w:p>
@@ -718,7 +663,7 @@
           <w:sz w:val="22"/>
           <w:szCs w:val="22"/>
         </w:rPr>
-        <w:t xml:space="preserve">VOL — volume percentage</w:t>
+        <w:t xml:space="preserve">VOL — volume</w:t>
       </w:r>
     </w:p>
     <w:p>
@@ -736,7 +681,7 @@
           <w:sz w:val="22"/>
           <w:szCs w:val="22"/>
         </w:rPr>
-        <w:t xml:space="preserve">GAP — word gap setting. GAP:OFF or GAP:5 etc.</w:t>
+        <w:t xml:space="preserve">GAP — word gap (OFF or 4–9)</w:t>
       </w:r>
     </w:p>
     <w:p>
@@ -754,7 +699,7 @@
           <w:sz w:val="22"/>
           <w:szCs w:val="22"/>
         </w:rPr>
-        <w:t xml:space="preserve">IAM or SK — Iambic or Straight Key mode</w:t>
+        <w:t xml:space="preserve">A / B / SK — Iambic Mode A, Iambic Mode B, or Straight Key</w:t>
       </w:r>
     </w:p>
     <w:p>
@@ -772,7 +717,7 @@
           <w:sz w:val="22"/>
           <w:szCs w:val="22"/>
         </w:rPr>
-        <w:t xml:space="preserve">SOLO or DUAL — whether a second unit is connected (DUAL shown in green)</w:t>
+        <w:t xml:space="preserve">SOLO / DUAL — whether a second unit is connected</w:t>
       </w:r>
     </w:p>
     <w:p>
@@ -785,23 +730,18 @@
     </w:p>
     <w:p>
       <w:pPr>
-        <w:spacing w:after="120"/>
-      </w:pPr>
-      <w:r>
-        <w:rPr>
-          <w:rFonts w:ascii="Arial" w:cs="Arial" w:eastAsia="Arial" w:hAnsi="Arial"/>
-          <w:sz w:val="22"/>
-          <w:szCs w:val="22"/>
-        </w:rPr>
-        <w:t xml:space="preserve">When you select a setting to adjust it lights up in color. When editing it shows bright.</w:t>
-      </w:r>
-    </w:p>
-    <w:p>
-      <w:pPr>
-        <w:spacing w:after="120"/>
-      </w:pPr>
-      <w:r>
-        <w:t xml:space="preserve"/>
+        <w:pStyle w:val="Heading1"/>
+      </w:pPr>
+      <w:r>
+        <w:rPr>
+          <w:rFonts w:ascii="Arial" w:cs="Arial" w:eastAsia="Arial" w:hAnsi="Arial"/>
+          <w:b/>
+          <w:bCs/>
+          <w:color w:val="2E4057"/>
+          <w:sz w:val="32"/>
+          <w:szCs w:val="32"/>
+        </w:rPr>
+        <w:t xml:space="preserve">3. Controls</w:t>
       </w:r>
     </w:p>
     <w:p>
@@ -817,81 +757,7 @@
           <w:sz w:val="26"/>
           <w:szCs w:val="26"/>
         </w:rPr>
-        <w:t xml:space="preserve">2.2 Status Area</w:t>
-      </w:r>
-    </w:p>
-    <w:p>
-      <w:pPr>
-        <w:spacing w:after="120"/>
-      </w:pPr>
-      <w:r>
-        <w:rPr>
-          <w:rFonts w:ascii="Arial" w:cs="Arial" w:eastAsia="Arial" w:hAnsi="Arial"/>
-          <w:sz w:val="22"/>
-          <w:szCs w:val="22"/>
-        </w:rPr>
-        <w:t xml:space="preserve">The bottom area shows the name and value of whichever setting is currently selected. Your unit ID (4 letters/numbers) and firmware version appear at the bottom right.</w:t>
-      </w:r>
-    </w:p>
-    <w:p>
-      <w:pPr>
-        <w:spacing w:after="120"/>
-      </w:pPr>
-      <w:r>
-        <w:t xml:space="preserve"/>
-      </w:r>
-    </w:p>
-    <w:p>
-      <w:pPr>
-        <w:pStyle w:val="Heading1"/>
-      </w:pPr>
-      <w:r>
-        <w:rPr>
-          <w:rFonts w:ascii="Arial" w:cs="Arial" w:eastAsia="Arial" w:hAnsi="Arial"/>
-          <w:b/>
-          <w:bCs/>
-          <w:color w:val="2E4057"/>
-          <w:sz w:val="32"/>
-          <w:szCs w:val="32"/>
-        </w:rPr>
-        <w:t xml:space="preserve">3. Controls</w:t>
-      </w:r>
-    </w:p>
-    <w:p>
-      <w:pPr>
-        <w:pStyle w:val="Heading2"/>
-      </w:pPr>
-      <w:r>
-        <w:rPr>
-          <w:rFonts w:ascii="Arial" w:cs="Arial" w:eastAsia="Arial" w:hAnsi="Arial"/>
-          <w:b/>
-          <w:bCs/>
-          <w:color w:val="048A81"/>
-          <w:sz w:val="26"/>
-          <w:szCs w:val="26"/>
-        </w:rPr>
-        <w:t xml:space="preserve">3.1 The Knob and Mode Button</w:t>
-      </w:r>
-    </w:p>
-    <w:p>
-      <w:pPr>
-        <w:spacing w:after="120"/>
-      </w:pPr>
-      <w:r>
-        <w:rPr>
-          <w:rFonts w:ascii="Arial" w:cs="Arial" w:eastAsia="Arial" w:hAnsi="Arial"/>
-          <w:sz w:val="22"/>
-          <w:szCs w:val="22"/>
-        </w:rPr>
-        <w:t xml:space="preserve">There are two controls for adjusting settings: a knob (potentiometer) and a small button next to it.</w:t>
-      </w:r>
-    </w:p>
-    <w:p>
-      <w:pPr>
-        <w:spacing w:after="120"/>
-      </w:pPr>
-      <w:r>
-        <w:t xml:space="preserve"/>
+        <w:t xml:space="preserve">3.1 Knob and Mode Button</w:t>
       </w:r>
     </w:p>
     <w:tbl>
@@ -908,20 +774,19 @@
       </w:tblPr>
       <w:tblGrid>
         <w:gridCol w:w="3120"/>
-        <w:gridCol w:w="3120"/>
-        <w:gridCol w:w="3120"/>
+        <w:gridCol w:w="6240"/>
       </w:tblGrid>
       <w:tr>
         <w:tc>
           <w:tcPr>
-            <w:tcW w:type="dxa" w:w="3120"/>
-            <w:tcBorders>
-              <w:top w:val="single" w:color="CCCCCC" w:sz="1"/>
-              <w:left w:val="single" w:color="CCCCCC" w:sz="1"/>
-              <w:bottom w:val="single" w:color="CCCCCC" w:sz="1"/>
-              <w:right w:val="single" w:color="CCCCCC" w:sz="1"/>
-            </w:tcBorders>
-            <w:shd w:fill="2E4057" w:val="clear"/>
+            <w:tcW w:type="dxa" w:w="3000"/>
+            <w:tcBorders>
+              <w:top w:val="single" w:color="CCCCCC" w:sz="1"/>
+              <w:left w:val="single" w:color="CCCCCC" w:sz="1"/>
+              <w:bottom w:val="single" w:color="CCCCCC" w:sz="1"/>
+              <w:right w:val="single" w:color="CCCCCC" w:sz="1"/>
+            </w:tcBorders>
+            <w:shd w:fill="048A81" w:val="clear"/>
             <w:tcMar>
               <w:top w:type="dxa" w:w="80"/>
               <w:left w:type="dxa" w:w="120"/>
@@ -945,14 +810,14 @@
         </w:tc>
         <w:tc>
           <w:tcPr>
-            <w:tcW w:type="dxa" w:w="3120"/>
-            <w:tcBorders>
-              <w:top w:val="single" w:color="CCCCCC" w:sz="1"/>
-              <w:left w:val="single" w:color="CCCCCC" w:sz="1"/>
-              <w:bottom w:val="single" w:color="CCCCCC" w:sz="1"/>
-              <w:right w:val="single" w:color="CCCCCC" w:sz="1"/>
-            </w:tcBorders>
-            <w:shd w:fill="2E4057" w:val="clear"/>
+            <w:tcW w:type="dxa" w:w="6360"/>
+            <w:tcBorders>
+              <w:top w:val="single" w:color="CCCCCC" w:sz="1"/>
+              <w:left w:val="single" w:color="CCCCCC" w:sz="1"/>
+              <w:bottom w:val="single" w:color="CCCCCC" w:sz="1"/>
+              <w:right w:val="single" w:color="CCCCCC" w:sz="1"/>
+            </w:tcBorders>
+            <w:shd w:fill="048A81" w:val="clear"/>
             <w:tcMar>
               <w:top w:type="dxa" w:w="80"/>
               <w:left w:type="dxa" w:w="120"/>
@@ -970,20 +835,22 @@
                 <w:sz w:val="20"/>
                 <w:szCs w:val="20"/>
               </w:rPr>
-              <w:t xml:space="preserve">What Happens</w:t>
-            </w:r>
-          </w:p>
-        </w:tc>
-        <w:tc>
-          <w:tcPr>
-            <w:tcW w:type="dxa" w:w="3120"/>
-            <w:tcBorders>
-              <w:top w:val="single" w:color="CCCCCC" w:sz="1"/>
-              <w:left w:val="single" w:color="CCCCCC" w:sz="1"/>
-              <w:bottom w:val="single" w:color="CCCCCC" w:sz="1"/>
-              <w:right w:val="single" w:color="CCCCCC" w:sz="1"/>
-            </w:tcBorders>
-            <w:shd w:fill="2E4057" w:val="clear"/>
+              <w:t xml:space="preserve">Result</w:t>
+            </w:r>
+          </w:p>
+        </w:tc>
+      </w:tr>
+      <w:tr>
+        <w:tc>
+          <w:tcPr>
+            <w:tcW w:type="dxa" w:w="3000"/>
+            <w:tcBorders>
+              <w:top w:val="single" w:color="CCCCCC" w:sz="1"/>
+              <w:left w:val="single" w:color="CCCCCC" w:sz="1"/>
+              <w:bottom w:val="single" w:color="CCCCCC" w:sz="1"/>
+              <w:right w:val="single" w:color="CCCCCC" w:sz="1"/>
+            </w:tcBorders>
+            <w:shd w:fill="F9F9F9" w:val="clear"/>
             <w:tcMar>
               <w:top w:type="dxa" w:w="80"/>
               <w:left w:type="dxa" w:w="120"/>
@@ -995,28 +862,26 @@
             <w:r>
               <w:rPr>
                 <w:rFonts w:ascii="Arial" w:cs="Arial" w:eastAsia="Arial" w:hAnsi="Arial"/>
-                <w:b/>
-                <w:bCs/>
-                <w:color w:val="FFFFFF"/>
-                <w:sz w:val="20"/>
-                <w:szCs w:val="20"/>
-              </w:rPr>
-              <w:t xml:space="preserve"/>
-            </w:r>
-          </w:p>
-        </w:tc>
-      </w:tr>
-      <w:tr>
-        <w:tc>
-          <w:tcPr>
-            <w:tcW w:type="dxa" w:w="3120"/>
-            <w:tcBorders>
-              <w:top w:val="single" w:color="CCCCCC" w:sz="1"/>
-              <w:left w:val="single" w:color="CCCCCC" w:sz="1"/>
-              <w:bottom w:val="single" w:color="CCCCCC" w:sz="1"/>
-              <w:right w:val="single" w:color="CCCCCC" w:sz="1"/>
-            </w:tcBorders>
-            <w:shd w:fill="F5F5F5" w:val="clear"/>
+                <w:b w:val="false"/>
+                <w:bCs w:val="false"/>
+                <w:color w:val="333333"/>
+                <w:sz w:val="20"/>
+                <w:szCs w:val="20"/>
+              </w:rPr>
+              <w:t xml:space="preserve">Short press</w:t>
+            </w:r>
+          </w:p>
+        </w:tc>
+        <w:tc>
+          <w:tcPr>
+            <w:tcW w:type="dxa" w:w="6360"/>
+            <w:tcBorders>
+              <w:top w:val="single" w:color="CCCCCC" w:sz="1"/>
+              <w:left w:val="single" w:color="CCCCCC" w:sz="1"/>
+              <w:bottom w:val="single" w:color="CCCCCC" w:sz="1"/>
+              <w:right w:val="single" w:color="CCCCCC" w:sz="1"/>
+            </w:tcBorders>
+            <w:shd w:fill="F9F9F9" w:val="clear"/>
             <w:tcMar>
               <w:top w:type="dxa" w:w="80"/>
               <w:left w:type="dxa" w:w="120"/>
@@ -1034,20 +899,22 @@
                 <w:sz w:val="20"/>
                 <w:szCs w:val="20"/>
               </w:rPr>
-              <w:t xml:space="preserve">Short press button</w:t>
-            </w:r>
-          </w:p>
-        </w:tc>
-        <w:tc>
-          <w:tcPr>
-            <w:tcW w:type="dxa" w:w="3120"/>
-            <w:tcBorders>
-              <w:top w:val="single" w:color="CCCCCC" w:sz="1"/>
-              <w:left w:val="single" w:color="CCCCCC" w:sz="1"/>
-              <w:bottom w:val="single" w:color="CCCCCC" w:sz="1"/>
-              <w:right w:val="single" w:color="CCCCCC" w:sz="1"/>
-            </w:tcBorders>
-            <w:shd w:fill="F5F5F5" w:val="clear"/>
+              <w:t xml:space="preserve">Cycle: WPM → FREQ → DELAY → VOL → GAP → WPM</w:t>
+            </w:r>
+          </w:p>
+        </w:tc>
+      </w:tr>
+      <w:tr>
+        <w:tc>
+          <w:tcPr>
+            <w:tcW w:type="dxa" w:w="3000"/>
+            <w:tcBorders>
+              <w:top w:val="single" w:color="CCCCCC" w:sz="1"/>
+              <w:left w:val="single" w:color="CCCCCC" w:sz="1"/>
+              <w:bottom w:val="single" w:color="CCCCCC" w:sz="1"/>
+              <w:right w:val="single" w:color="CCCCCC" w:sz="1"/>
+            </w:tcBorders>
+            <w:shd w:fill="F9F9F9" w:val="clear"/>
             <w:tcMar>
               <w:top w:type="dxa" w:w="80"/>
               <w:left w:type="dxa" w:w="120"/>
@@ -1065,20 +932,20 @@
                 <w:sz w:val="20"/>
                 <w:szCs w:val="20"/>
               </w:rPr>
-              <w:t xml:space="preserve">Moves to next setting</w:t>
-            </w:r>
-          </w:p>
-        </w:tc>
-        <w:tc>
-          <w:tcPr>
-            <w:tcW w:type="dxa" w:w="3120"/>
-            <w:tcBorders>
-              <w:top w:val="single" w:color="CCCCCC" w:sz="1"/>
-              <w:left w:val="single" w:color="CCCCCC" w:sz="1"/>
-              <w:bottom w:val="single" w:color="CCCCCC" w:sz="1"/>
-              <w:right w:val="single" w:color="CCCCCC" w:sz="1"/>
-            </w:tcBorders>
-            <w:shd w:fill="F5F5F5" w:val="clear"/>
+              <w:t xml:space="preserve">Long press (1s)</w:t>
+            </w:r>
+          </w:p>
+        </w:tc>
+        <w:tc>
+          <w:tcPr>
+            <w:tcW w:type="dxa" w:w="6360"/>
+            <w:tcBorders>
+              <w:top w:val="single" w:color="CCCCCC" w:sz="1"/>
+              <w:left w:val="single" w:color="CCCCCC" w:sz="1"/>
+              <w:bottom w:val="single" w:color="CCCCCC" w:sz="1"/>
+              <w:right w:val="single" w:color="CCCCCC" w:sz="1"/>
+            </w:tcBorders>
+            <w:shd w:fill="F9F9F9" w:val="clear"/>
             <w:tcMar>
               <w:top w:type="dxa" w:w="80"/>
               <w:left w:type="dxa" w:w="120"/>
@@ -1096,7 +963,7 @@
                 <w:sz w:val="20"/>
                 <w:szCs w:val="20"/>
               </w:rPr>
-              <w:t xml:space="preserve">WPM → FREQ → DELAY → VOL → GAP → WPM</w:t>
+              <w:t xml:space="preserve">Enter or exit edit mode — [EDIT] appears</w:t>
             </w:r>
           </w:p>
         </w:tc>
@@ -1104,14 +971,14 @@
       <w:tr>
         <w:tc>
           <w:tcPr>
-            <w:tcW w:type="dxa" w:w="3120"/>
-            <w:tcBorders>
-              <w:top w:val="single" w:color="CCCCCC" w:sz="1"/>
-              <w:left w:val="single" w:color="CCCCCC" w:sz="1"/>
-              <w:bottom w:val="single" w:color="CCCCCC" w:sz="1"/>
-              <w:right w:val="single" w:color="CCCCCC" w:sz="1"/>
-            </w:tcBorders>
-            <w:shd w:fill="F5F5F5" w:val="clear"/>
+            <w:tcW w:type="dxa" w:w="3000"/>
+            <w:tcBorders>
+              <w:top w:val="single" w:color="CCCCCC" w:sz="1"/>
+              <w:left w:val="single" w:color="CCCCCC" w:sz="1"/>
+              <w:bottom w:val="single" w:color="CCCCCC" w:sz="1"/>
+              <w:right w:val="single" w:color="CCCCCC" w:sz="1"/>
+            </w:tcBorders>
+            <w:shd w:fill="F9F9F9" w:val="clear"/>
             <w:tcMar>
               <w:top w:type="dxa" w:w="80"/>
               <w:left w:type="dxa" w:w="120"/>
@@ -1129,20 +996,20 @@
                 <w:sz w:val="20"/>
                 <w:szCs w:val="20"/>
               </w:rPr>
-              <w:t xml:space="preserve">Long press (1 sec)</w:t>
-            </w:r>
-          </w:p>
-        </w:tc>
-        <w:tc>
-          <w:tcPr>
-            <w:tcW w:type="dxa" w:w="3120"/>
-            <w:tcBorders>
-              <w:top w:val="single" w:color="CCCCCC" w:sz="1"/>
-              <w:left w:val="single" w:color="CCCCCC" w:sz="1"/>
-              <w:bottom w:val="single" w:color="CCCCCC" w:sz="1"/>
-              <w:right w:val="single" w:color="CCCCCC" w:sz="1"/>
-            </w:tcBorders>
-            <w:shd w:fill="F5F5F5" w:val="clear"/>
+              <w:t xml:space="preserve">Turn knob (in edit)</w:t>
+            </w:r>
+          </w:p>
+        </w:tc>
+        <w:tc>
+          <w:tcPr>
+            <w:tcW w:type="dxa" w:w="6360"/>
+            <w:tcBorders>
+              <w:top w:val="single" w:color="CCCCCC" w:sz="1"/>
+              <w:left w:val="single" w:color="CCCCCC" w:sz="1"/>
+              <w:bottom w:val="single" w:color="CCCCCC" w:sz="1"/>
+              <w:right w:val="single" w:color="CCCCCC" w:sz="1"/>
+            </w:tcBorders>
+            <w:shd w:fill="F9F9F9" w:val="clear"/>
             <w:tcMar>
               <w:top w:type="dxa" w:w="80"/>
               <w:left w:type="dxa" w:w="120"/>
@@ -1160,20 +1027,22 @@
                 <w:sz w:val="20"/>
                 <w:szCs w:val="20"/>
               </w:rPr>
-              <w:t xml:space="preserve">Enters or exits edit mode</w:t>
-            </w:r>
-          </w:p>
-        </w:tc>
-        <w:tc>
-          <w:tcPr>
-            <w:tcW w:type="dxa" w:w="3120"/>
-            <w:tcBorders>
-              <w:top w:val="single" w:color="CCCCCC" w:sz="1"/>
-              <w:left w:val="single" w:color="CCCCCC" w:sz="1"/>
-              <w:bottom w:val="single" w:color="CCCCCC" w:sz="1"/>
-              <w:right w:val="single" w:color="CCCCCC" w:sz="1"/>
-            </w:tcBorders>
-            <w:shd w:fill="F5F5F5" w:val="clear"/>
+              <w:t xml:space="preserve">Adjust value</w:t>
+            </w:r>
+          </w:p>
+        </w:tc>
+      </w:tr>
+      <w:tr>
+        <w:tc>
+          <w:tcPr>
+            <w:tcW w:type="dxa" w:w="3000"/>
+            <w:tcBorders>
+              <w:top w:val="single" w:color="CCCCCC" w:sz="1"/>
+              <w:left w:val="single" w:color="CCCCCC" w:sz="1"/>
+              <w:bottom w:val="single" w:color="CCCCCC" w:sz="1"/>
+              <w:right w:val="single" w:color="CCCCCC" w:sz="1"/>
+            </w:tcBorders>
+            <w:shd w:fill="F9F9F9" w:val="clear"/>
             <w:tcMar>
               <w:top w:type="dxa" w:w="80"/>
               <w:left w:type="dxa" w:w="120"/>
@@ -1191,22 +1060,20 @@
                 <w:sz w:val="20"/>
                 <w:szCs w:val="20"/>
               </w:rPr>
-              <w:t xml:space="preserve">[EDIT] appears in status area</w:t>
-            </w:r>
-          </w:p>
-        </w:tc>
-      </w:tr>
-      <w:tr>
-        <w:tc>
-          <w:tcPr>
-            <w:tcW w:type="dxa" w:w="3120"/>
-            <w:tcBorders>
-              <w:top w:val="single" w:color="CCCCCC" w:sz="1"/>
-              <w:left w:val="single" w:color="CCCCCC" w:sz="1"/>
-              <w:bottom w:val="single" w:color="CCCCCC" w:sz="1"/>
-              <w:right w:val="single" w:color="CCCCCC" w:sz="1"/>
-            </w:tcBorders>
-            <w:shd w:fill="F5F5F5" w:val="clear"/>
+              <w:t xml:space="preserve">Short press (in edit)</w:t>
+            </w:r>
+          </w:p>
+        </w:tc>
+        <w:tc>
+          <w:tcPr>
+            <w:tcW w:type="dxa" w:w="6360"/>
+            <w:tcBorders>
+              <w:top w:val="single" w:color="CCCCCC" w:sz="1"/>
+              <w:left w:val="single" w:color="CCCCCC" w:sz="1"/>
+              <w:bottom w:val="single" w:color="CCCCCC" w:sz="1"/>
+              <w:right w:val="single" w:color="CCCCCC" w:sz="1"/>
+            </w:tcBorders>
+            <w:shd w:fill="F9F9F9" w:val="clear"/>
             <w:tcMar>
               <w:top w:type="dxa" w:w="80"/>
               <w:left w:type="dxa" w:w="120"/>
@@ -1224,204 +1091,12 @@
                 <w:sz w:val="20"/>
                 <w:szCs w:val="20"/>
               </w:rPr>
-              <w:t xml:space="preserve">Turn knob (in edit)</w:t>
-            </w:r>
-          </w:p>
-        </w:tc>
-        <w:tc>
-          <w:tcPr>
-            <w:tcW w:type="dxa" w:w="3120"/>
-            <w:tcBorders>
-              <w:top w:val="single" w:color="CCCCCC" w:sz="1"/>
-              <w:left w:val="single" w:color="CCCCCC" w:sz="1"/>
-              <w:bottom w:val="single" w:color="CCCCCC" w:sz="1"/>
-              <w:right w:val="single" w:color="CCCCCC" w:sz="1"/>
-            </w:tcBorders>
-            <w:shd w:fill="F5F5F5" w:val="clear"/>
-            <w:tcMar>
-              <w:top w:type="dxa" w:w="80"/>
-              <w:left w:type="dxa" w:w="120"/>
-              <w:bottom w:type="dxa" w:w="80"/>
-              <w:right w:type="dxa" w:w="120"/>
-            </w:tcMar>
-          </w:tcPr>
-          <w:p>
-            <w:r>
-              <w:rPr>
-                <w:rFonts w:ascii="Arial" w:cs="Arial" w:eastAsia="Arial" w:hAnsi="Arial"/>
-                <w:b w:val="false"/>
-                <w:bCs w:val="false"/>
-                <w:color w:val="333333"/>
-                <w:sz w:val="20"/>
-                <w:szCs w:val="20"/>
-              </w:rPr>
-              <w:t xml:space="preserve">Adjusts the selected setting</w:t>
-            </w:r>
-          </w:p>
-        </w:tc>
-        <w:tc>
-          <w:tcPr>
-            <w:tcW w:type="dxa" w:w="3120"/>
-            <w:tcBorders>
-              <w:top w:val="single" w:color="CCCCCC" w:sz="1"/>
-              <w:left w:val="single" w:color="CCCCCC" w:sz="1"/>
-              <w:bottom w:val="single" w:color="CCCCCC" w:sz="1"/>
-              <w:right w:val="single" w:color="CCCCCC" w:sz="1"/>
-            </w:tcBorders>
-            <w:shd w:fill="F5F5F5" w:val="clear"/>
-            <w:tcMar>
-              <w:top w:type="dxa" w:w="80"/>
-              <w:left w:type="dxa" w:w="120"/>
-              <w:bottom w:type="dxa" w:w="80"/>
-              <w:right w:type="dxa" w:w="120"/>
-            </w:tcMar>
-          </w:tcPr>
-          <w:p>
-            <w:r>
-              <w:rPr>
-                <w:rFonts w:ascii="Arial" w:cs="Arial" w:eastAsia="Arial" w:hAnsi="Arial"/>
-                <w:b w:val="false"/>
-                <w:bCs w:val="false"/>
-                <w:color w:val="333333"/>
-                <w:sz w:val="20"/>
-                <w:szCs w:val="20"/>
-              </w:rPr>
-              <w:t xml:space="preserve">Value changes in real time</w:t>
-            </w:r>
-          </w:p>
-        </w:tc>
-      </w:tr>
-      <w:tr>
-        <w:tc>
-          <w:tcPr>
-            <w:tcW w:type="dxa" w:w="3120"/>
-            <w:tcBorders>
-              <w:top w:val="single" w:color="CCCCCC" w:sz="1"/>
-              <w:left w:val="single" w:color="CCCCCC" w:sz="1"/>
-              <w:bottom w:val="single" w:color="CCCCCC" w:sz="1"/>
-              <w:right w:val="single" w:color="CCCCCC" w:sz="1"/>
-            </w:tcBorders>
-            <w:shd w:fill="F5F5F5" w:val="clear"/>
-            <w:tcMar>
-              <w:top w:type="dxa" w:w="80"/>
-              <w:left w:type="dxa" w:w="120"/>
-              <w:bottom w:type="dxa" w:w="80"/>
-              <w:right w:type="dxa" w:w="120"/>
-            </w:tcMar>
-          </w:tcPr>
-          <w:p>
-            <w:r>
-              <w:rPr>
-                <w:rFonts w:ascii="Arial" w:cs="Arial" w:eastAsia="Arial" w:hAnsi="Arial"/>
-                <w:b w:val="false"/>
-                <w:bCs w:val="false"/>
-                <w:color w:val="333333"/>
-                <w:sz w:val="20"/>
-                <w:szCs w:val="20"/>
-              </w:rPr>
-              <w:t xml:space="preserve">Short press (in edit)</w:t>
-            </w:r>
-          </w:p>
-        </w:tc>
-        <w:tc>
-          <w:tcPr>
-            <w:tcW w:type="dxa" w:w="3120"/>
-            <w:tcBorders>
-              <w:top w:val="single" w:color="CCCCCC" w:sz="1"/>
-              <w:left w:val="single" w:color="CCCCCC" w:sz="1"/>
-              <w:bottom w:val="single" w:color="CCCCCC" w:sz="1"/>
-              <w:right w:val="single" w:color="CCCCCC" w:sz="1"/>
-            </w:tcBorders>
-            <w:shd w:fill="F5F5F5" w:val="clear"/>
-            <w:tcMar>
-              <w:top w:type="dxa" w:w="80"/>
-              <w:left w:type="dxa" w:w="120"/>
-              <w:bottom w:type="dxa" w:w="80"/>
-              <w:right w:type="dxa" w:w="120"/>
-            </w:tcMar>
-          </w:tcPr>
-          <w:p>
-            <w:r>
-              <w:rPr>
-                <w:rFonts w:ascii="Arial" w:cs="Arial" w:eastAsia="Arial" w:hAnsi="Arial"/>
-                <w:b w:val="false"/>
-                <w:bCs w:val="false"/>
-                <w:color w:val="333333"/>
-                <w:sz w:val="20"/>
-                <w:szCs w:val="20"/>
-              </w:rPr>
-              <w:t xml:space="preserve">Saves and exits edit mode</w:t>
-            </w:r>
-          </w:p>
-        </w:tc>
-        <w:tc>
-          <w:tcPr>
-            <w:tcW w:type="dxa" w:w="3120"/>
-            <w:tcBorders>
-              <w:top w:val="single" w:color="CCCCCC" w:sz="1"/>
-              <w:left w:val="single" w:color="CCCCCC" w:sz="1"/>
-              <w:bottom w:val="single" w:color="CCCCCC" w:sz="1"/>
-              <w:right w:val="single" w:color="CCCCCC" w:sz="1"/>
-            </w:tcBorders>
-            <w:shd w:fill="F5F5F5" w:val="clear"/>
-            <w:tcMar>
-              <w:top w:type="dxa" w:w="80"/>
-              <w:left w:type="dxa" w:w="120"/>
-              <w:bottom w:type="dxa" w:w="80"/>
-              <w:right w:type="dxa" w:w="120"/>
-            </w:tcMar>
-          </w:tcPr>
-          <w:p>
-            <w:r>
-              <w:rPr>
-                <w:rFonts w:ascii="Arial" w:cs="Arial" w:eastAsia="Arial" w:hAnsi="Arial"/>
-                <w:b w:val="false"/>
-                <w:bCs w:val="false"/>
-                <w:color w:val="333333"/>
-                <w:sz w:val="20"/>
-                <w:szCs w:val="20"/>
-              </w:rPr>
-              <w:t xml:space="preserve">Returns to normal</w:t>
+              <w:t xml:space="preserve">Save and exit</w:t>
             </w:r>
           </w:p>
         </w:tc>
       </w:tr>
     </w:tbl>
-    <w:p>
-      <w:pPr>
-        <w:spacing w:after="120"/>
-      </w:pPr>
-      <w:r>
-        <w:t xml:space="preserve"/>
-      </w:r>
-    </w:p>
-    <w:p>
-      <w:pPr>
-        <w:spacing w:after="80" w:before="80"/>
-        <w:ind w:left="360"/>
-      </w:pPr>
-      <w:r>
-        <w:rPr>
-          <w:rFonts w:ascii="Arial" w:cs="Arial" w:eastAsia="Arial" w:hAnsi="Arial"/>
-          <w:b/>
-          <w:bCs/>
-          <w:color w:val="C0392B"/>
-          <w:sz w:val="22"/>
-          <w:szCs w:val="22"/>
-        </w:rPr>
-        <w:t xml:space="preserve">NOTE: </w:t>
-      </w:r>
-      <w:r>
-        <w:rPr>
-          <w:rFonts w:ascii="Arial" w:cs="Arial" w:eastAsia="Arial" w:hAnsi="Arial"/>
-          <w:i/>
-          <w:iCs/>
-          <w:sz w:val="22"/>
-          <w:szCs w:val="22"/>
-        </w:rPr>
-        <w:t xml:space="preserve">The knob only changes values when you are in edit mode. This prevents accidental changes.</w:t>
-      </w:r>
-    </w:p>
     <w:p>
       <w:pPr>
         <w:spacing w:after="120"/>
@@ -1443,7 +1118,7 @@
           <w:sz w:val="26"/>
           <w:szCs w:val="26"/>
         </w:rPr>
-        <w:t xml:space="preserve">3.2 Settings You Can Adjust</w:t>
+        <w:t xml:space="preserve">3.2 Paddle Reverse Button</w:t>
       </w:r>
     </w:p>
     <w:tbl>
@@ -1459,21 +1134,20 @@
         </w:tblBorders>
       </w:tblPr>
       <w:tblGrid>
-        <w:gridCol w:w="2000"/>
-        <w:gridCol w:w="3680"/>
-        <w:gridCol w:w="3680"/>
+        <w:gridCol w:w="3120"/>
+        <w:gridCol w:w="6240"/>
       </w:tblGrid>
       <w:tr>
         <w:tc>
           <w:tcPr>
-            <w:tcW w:type="dxa" w:w="3120"/>
-            <w:tcBorders>
-              <w:top w:val="single" w:color="CCCCCC" w:sz="1"/>
-              <w:left w:val="single" w:color="CCCCCC" w:sz="1"/>
-              <w:bottom w:val="single" w:color="CCCCCC" w:sz="1"/>
-              <w:right w:val="single" w:color="CCCCCC" w:sz="1"/>
-            </w:tcBorders>
-            <w:shd w:fill="2E4057" w:val="clear"/>
+            <w:tcW w:type="dxa" w:w="3000"/>
+            <w:tcBorders>
+              <w:top w:val="single" w:color="CCCCCC" w:sz="1"/>
+              <w:left w:val="single" w:color="CCCCCC" w:sz="1"/>
+              <w:bottom w:val="single" w:color="CCCCCC" w:sz="1"/>
+              <w:right w:val="single" w:color="CCCCCC" w:sz="1"/>
+            </w:tcBorders>
+            <w:shd w:fill="048A81" w:val="clear"/>
             <w:tcMar>
               <w:top w:type="dxa" w:w="80"/>
               <w:left w:type="dxa" w:w="120"/>
@@ -1491,20 +1165,20 @@
                 <w:sz w:val="20"/>
                 <w:szCs w:val="20"/>
               </w:rPr>
-              <w:t xml:space="preserve">Setting</w:t>
-            </w:r>
-          </w:p>
-        </w:tc>
-        <w:tc>
-          <w:tcPr>
-            <w:tcW w:type="dxa" w:w="3120"/>
-            <w:tcBorders>
-              <w:top w:val="single" w:color="CCCCCC" w:sz="1"/>
-              <w:left w:val="single" w:color="CCCCCC" w:sz="1"/>
-              <w:bottom w:val="single" w:color="CCCCCC" w:sz="1"/>
-              <w:right w:val="single" w:color="CCCCCC" w:sz="1"/>
-            </w:tcBorders>
-            <w:shd w:fill="2E4057" w:val="clear"/>
+              <w:t xml:space="preserve">Press</w:t>
+            </w:r>
+          </w:p>
+        </w:tc>
+        <w:tc>
+          <w:tcPr>
+            <w:tcW w:type="dxa" w:w="6360"/>
+            <w:tcBorders>
+              <w:top w:val="single" w:color="CCCCCC" w:sz="1"/>
+              <w:left w:val="single" w:color="CCCCCC" w:sz="1"/>
+              <w:bottom w:val="single" w:color="CCCCCC" w:sz="1"/>
+              <w:right w:val="single" w:color="CCCCCC" w:sz="1"/>
+            </w:tcBorders>
+            <w:shd w:fill="048A81" w:val="clear"/>
             <w:tcMar>
               <w:top w:type="dxa" w:w="80"/>
               <w:left w:type="dxa" w:w="120"/>
@@ -1522,20 +1196,22 @@
                 <w:sz w:val="20"/>
                 <w:szCs w:val="20"/>
               </w:rPr>
-              <w:t xml:space="preserve">Range</w:t>
-            </w:r>
-          </w:p>
-        </w:tc>
-        <w:tc>
-          <w:tcPr>
-            <w:tcW w:type="dxa" w:w="3120"/>
-            <w:tcBorders>
-              <w:top w:val="single" w:color="CCCCCC" w:sz="1"/>
-              <w:left w:val="single" w:color="CCCCCC" w:sz="1"/>
-              <w:bottom w:val="single" w:color="CCCCCC" w:sz="1"/>
-              <w:right w:val="single" w:color="CCCCCC" w:sz="1"/>
-            </w:tcBorders>
-            <w:shd w:fill="2E4057" w:val="clear"/>
+              <w:t xml:space="preserve">Action</w:t>
+            </w:r>
+          </w:p>
+        </w:tc>
+      </w:tr>
+      <w:tr>
+        <w:tc>
+          <w:tcPr>
+            <w:tcW w:type="dxa" w:w="3000"/>
+            <w:tcBorders>
+              <w:top w:val="single" w:color="CCCCCC" w:sz="1"/>
+              <w:left w:val="single" w:color="CCCCCC" w:sz="1"/>
+              <w:bottom w:val="single" w:color="CCCCCC" w:sz="1"/>
+              <w:right w:val="single" w:color="CCCCCC" w:sz="1"/>
+            </w:tcBorders>
+            <w:shd w:fill="F9F9F9" w:val="clear"/>
             <w:tcMar>
               <w:top w:type="dxa" w:w="80"/>
               <w:left w:type="dxa" w:w="120"/>
@@ -1547,28 +1223,26 @@
             <w:r>
               <w:rPr>
                 <w:rFonts w:ascii="Arial" w:cs="Arial" w:eastAsia="Arial" w:hAnsi="Arial"/>
-                <w:b/>
-                <w:bCs/>
-                <w:color w:val="FFFFFF"/>
-                <w:sz w:val="20"/>
-                <w:szCs w:val="20"/>
-              </w:rPr>
-              <w:t xml:space="preserve">Notes</w:t>
-            </w:r>
-          </w:p>
-        </w:tc>
-      </w:tr>
-      <w:tr>
-        <w:tc>
-          <w:tcPr>
-            <w:tcW w:type="dxa" w:w="3120"/>
-            <w:tcBorders>
-              <w:top w:val="single" w:color="CCCCCC" w:sz="1"/>
-              <w:left w:val="single" w:color="CCCCCC" w:sz="1"/>
-              <w:bottom w:val="single" w:color="CCCCCC" w:sz="1"/>
-              <w:right w:val="single" w:color="CCCCCC" w:sz="1"/>
-            </w:tcBorders>
-            <w:shd w:fill="F5F5F5" w:val="clear"/>
+                <w:b w:val="false"/>
+                <w:bCs w:val="false"/>
+                <w:color w:val="333333"/>
+                <w:sz w:val="20"/>
+                <w:szCs w:val="20"/>
+              </w:rPr>
+              <w:t xml:space="preserve">Short press</w:t>
+            </w:r>
+          </w:p>
+        </w:tc>
+        <w:tc>
+          <w:tcPr>
+            <w:tcW w:type="dxa" w:w="6360"/>
+            <w:tcBorders>
+              <w:top w:val="single" w:color="CCCCCC" w:sz="1"/>
+              <w:left w:val="single" w:color="CCCCCC" w:sz="1"/>
+              <w:bottom w:val="single" w:color="CCCCCC" w:sz="1"/>
+              <w:right w:val="single" w:color="CCCCCC" w:sz="1"/>
+            </w:tcBorders>
+            <w:shd w:fill="F9F9F9" w:val="clear"/>
             <w:tcMar>
               <w:top w:type="dxa" w:w="80"/>
               <w:left w:type="dxa" w:w="120"/>
@@ -1586,20 +1260,22 @@
                 <w:sz w:val="20"/>
                 <w:szCs w:val="20"/>
               </w:rPr>
-              <w:t xml:space="preserve">WPM (char speed)</w:t>
-            </w:r>
-          </w:p>
-        </w:tc>
-        <w:tc>
-          <w:tcPr>
-            <w:tcW w:type="dxa" w:w="3120"/>
-            <w:tcBorders>
-              <w:top w:val="single" w:color="CCCCCC" w:sz="1"/>
-              <w:left w:val="single" w:color="CCCCCC" w:sz="1"/>
-              <w:bottom w:val="single" w:color="CCCCCC" w:sz="1"/>
-              <w:right w:val="single" w:color="CCCCCC" w:sz="1"/>
-            </w:tcBorders>
-            <w:shd w:fill="F5F5F5" w:val="clear"/>
+              <w:t xml:space="preserve">Toggle dit/dah swap</w:t>
+            </w:r>
+          </w:p>
+        </w:tc>
+      </w:tr>
+      <w:tr>
+        <w:tc>
+          <w:tcPr>
+            <w:tcW w:type="dxa" w:w="3000"/>
+            <w:tcBorders>
+              <w:top w:val="single" w:color="CCCCCC" w:sz="1"/>
+              <w:left w:val="single" w:color="CCCCCC" w:sz="1"/>
+              <w:bottom w:val="single" w:color="CCCCCC" w:sz="1"/>
+              <w:right w:val="single" w:color="CCCCCC" w:sz="1"/>
+            </w:tcBorders>
+            <w:shd w:fill="F9F9F9" w:val="clear"/>
             <w:tcMar>
               <w:top w:type="dxa" w:w="80"/>
               <w:left w:type="dxa" w:w="120"/>
@@ -1617,20 +1293,20 @@
                 <w:sz w:val="20"/>
                 <w:szCs w:val="20"/>
               </w:rPr>
-              <w:t xml:space="preserve">5–40 WPM</w:t>
-            </w:r>
-          </w:p>
-        </w:tc>
-        <w:tc>
-          <w:tcPr>
-            <w:tcW w:type="dxa" w:w="3120"/>
-            <w:tcBorders>
-              <w:top w:val="single" w:color="CCCCCC" w:sz="1"/>
-              <w:left w:val="single" w:color="CCCCCC" w:sz="1"/>
-              <w:bottom w:val="single" w:color="CCCCCC" w:sz="1"/>
-              <w:right w:val="single" w:color="CCCCCC" w:sz="1"/>
-            </w:tcBorders>
-            <w:shd w:fill="F5F5F5" w:val="clear"/>
+              <w:t xml:space="preserve">Long press (1s)</w:t>
+            </w:r>
+          </w:p>
+        </w:tc>
+        <w:tc>
+          <w:tcPr>
+            <w:tcW w:type="dxa" w:w="6360"/>
+            <w:tcBorders>
+              <w:top w:val="single" w:color="CCCCCC" w:sz="1"/>
+              <w:left w:val="single" w:color="CCCCCC" w:sz="1"/>
+              <w:bottom w:val="single" w:color="CCCCCC" w:sz="1"/>
+              <w:right w:val="single" w:color="CCCCCC" w:sz="1"/>
+            </w:tcBorders>
+            <w:shd w:fill="F9F9F9" w:val="clear"/>
             <w:tcMar>
               <w:top w:type="dxa" w:w="80"/>
               <w:left w:type="dxa" w:w="120"/>
@@ -1648,482 +1324,7 @@
                 <w:sz w:val="20"/>
                 <w:szCs w:val="20"/>
               </w:rPr>
-              <w:t xml:space="preserve">How fast individual characters sound</w:t>
-            </w:r>
-          </w:p>
-        </w:tc>
-      </w:tr>
-      <w:tr>
-        <w:tc>
-          <w:tcPr>
-            <w:tcW w:type="dxa" w:w="3120"/>
-            <w:tcBorders>
-              <w:top w:val="single" w:color="CCCCCC" w:sz="1"/>
-              <w:left w:val="single" w:color="CCCCCC" w:sz="1"/>
-              <w:bottom w:val="single" w:color="CCCCCC" w:sz="1"/>
-              <w:right w:val="single" w:color="CCCCCC" w:sz="1"/>
-            </w:tcBorders>
-            <w:shd w:fill="F5F5F5" w:val="clear"/>
-            <w:tcMar>
-              <w:top w:type="dxa" w:w="80"/>
-              <w:left w:type="dxa" w:w="120"/>
-              <w:bottom w:type="dxa" w:w="80"/>
-              <w:right w:type="dxa" w:w="120"/>
-            </w:tcMar>
-          </w:tcPr>
-          <w:p>
-            <w:r>
-              <w:rPr>
-                <w:rFonts w:ascii="Arial" w:cs="Arial" w:eastAsia="Arial" w:hAnsi="Arial"/>
-                <w:b w:val="false"/>
-                <w:bCs w:val="false"/>
-                <w:color w:val="333333"/>
-                <w:sz w:val="20"/>
-                <w:szCs w:val="20"/>
-              </w:rPr>
-              <w:t xml:space="preserve">WPM (Farnsworth)</w:t>
-            </w:r>
-          </w:p>
-        </w:tc>
-        <w:tc>
-          <w:tcPr>
-            <w:tcW w:type="dxa" w:w="3120"/>
-            <w:tcBorders>
-              <w:top w:val="single" w:color="CCCCCC" w:sz="1"/>
-              <w:left w:val="single" w:color="CCCCCC" w:sz="1"/>
-              <w:bottom w:val="single" w:color="CCCCCC" w:sz="1"/>
-              <w:right w:val="single" w:color="CCCCCC" w:sz="1"/>
-            </w:tcBorders>
-            <w:shd w:fill="F5F5F5" w:val="clear"/>
-            <w:tcMar>
-              <w:top w:type="dxa" w:w="80"/>
-              <w:left w:type="dxa" w:w="120"/>
-              <w:bottom w:type="dxa" w:w="80"/>
-              <w:right w:type="dxa" w:w="120"/>
-            </w:tcMar>
-          </w:tcPr>
-          <w:p>
-            <w:r>
-              <w:rPr>
-                <w:rFonts w:ascii="Arial" w:cs="Arial" w:eastAsia="Arial" w:hAnsi="Arial"/>
-                <w:b w:val="false"/>
-                <w:bCs w:val="false"/>
-                <w:color w:val="333333"/>
-                <w:sz w:val="20"/>
-                <w:szCs w:val="20"/>
-              </w:rPr>
-              <w:t xml:space="preserve">4 WPM – char speed</w:t>
-            </w:r>
-          </w:p>
-        </w:tc>
-        <w:tc>
-          <w:tcPr>
-            <w:tcW w:type="dxa" w:w="3120"/>
-            <w:tcBorders>
-              <w:top w:val="single" w:color="CCCCCC" w:sz="1"/>
-              <w:left w:val="single" w:color="CCCCCC" w:sz="1"/>
-              <w:bottom w:val="single" w:color="CCCCCC" w:sz="1"/>
-              <w:right w:val="single" w:color="CCCCCC" w:sz="1"/>
-            </w:tcBorders>
-            <w:shd w:fill="F5F5F5" w:val="clear"/>
-            <w:tcMar>
-              <w:top w:type="dxa" w:w="80"/>
-              <w:left w:type="dxa" w:w="120"/>
-              <w:bottom w:type="dxa" w:w="80"/>
-              <w:right w:type="dxa" w:w="120"/>
-            </w:tcMar>
-          </w:tcPr>
-          <w:p>
-            <w:r>
-              <w:rPr>
-                <w:rFonts w:ascii="Arial" w:cs="Arial" w:eastAsia="Arial" w:hAnsi="Arial"/>
-                <w:b w:val="false"/>
-                <w:bCs w:val="false"/>
-                <w:color w:val="333333"/>
-                <w:sz w:val="20"/>
-                <w:szCs w:val="20"/>
-              </w:rPr>
-              <w:t xml:space="preserve">Overall effective speed with extra gaps</w:t>
-            </w:r>
-          </w:p>
-        </w:tc>
-      </w:tr>
-      <w:tr>
-        <w:tc>
-          <w:tcPr>
-            <w:tcW w:type="dxa" w:w="3120"/>
-            <w:tcBorders>
-              <w:top w:val="single" w:color="CCCCCC" w:sz="1"/>
-              <w:left w:val="single" w:color="CCCCCC" w:sz="1"/>
-              <w:bottom w:val="single" w:color="CCCCCC" w:sz="1"/>
-              <w:right w:val="single" w:color="CCCCCC" w:sz="1"/>
-            </w:tcBorders>
-            <w:shd w:fill="F5F5F5" w:val="clear"/>
-            <w:tcMar>
-              <w:top w:type="dxa" w:w="80"/>
-              <w:left w:type="dxa" w:w="120"/>
-              <w:bottom w:type="dxa" w:w="80"/>
-              <w:right w:type="dxa" w:w="120"/>
-            </w:tcMar>
-          </w:tcPr>
-          <w:p>
-            <w:r>
-              <w:rPr>
-                <w:rFonts w:ascii="Arial" w:cs="Arial" w:eastAsia="Arial" w:hAnsi="Arial"/>
-                <w:b w:val="false"/>
-                <w:bCs w:val="false"/>
-                <w:color w:val="333333"/>
-                <w:sz w:val="20"/>
-                <w:szCs w:val="20"/>
-              </w:rPr>
-              <w:t xml:space="preserve">FREQ</w:t>
-            </w:r>
-          </w:p>
-        </w:tc>
-        <w:tc>
-          <w:tcPr>
-            <w:tcW w:type="dxa" w:w="3120"/>
-            <w:tcBorders>
-              <w:top w:val="single" w:color="CCCCCC" w:sz="1"/>
-              <w:left w:val="single" w:color="CCCCCC" w:sz="1"/>
-              <w:bottom w:val="single" w:color="CCCCCC" w:sz="1"/>
-              <w:right w:val="single" w:color="CCCCCC" w:sz="1"/>
-            </w:tcBorders>
-            <w:shd w:fill="F5F5F5" w:val="clear"/>
-            <w:tcMar>
-              <w:top w:type="dxa" w:w="80"/>
-              <w:left w:type="dxa" w:w="120"/>
-              <w:bottom w:type="dxa" w:w="80"/>
-              <w:right w:type="dxa" w:w="120"/>
-            </w:tcMar>
-          </w:tcPr>
-          <w:p>
-            <w:r>
-              <w:rPr>
-                <w:rFonts w:ascii="Arial" w:cs="Arial" w:eastAsia="Arial" w:hAnsi="Arial"/>
-                <w:b w:val="false"/>
-                <w:bCs w:val="false"/>
-                <w:color w:val="333333"/>
-                <w:sz w:val="20"/>
-                <w:szCs w:val="20"/>
-              </w:rPr>
-              <w:t xml:space="preserve">400–900 Hz</w:t>
-            </w:r>
-          </w:p>
-        </w:tc>
-        <w:tc>
-          <w:tcPr>
-            <w:tcW w:type="dxa" w:w="3120"/>
-            <w:tcBorders>
-              <w:top w:val="single" w:color="CCCCCC" w:sz="1"/>
-              <w:left w:val="single" w:color="CCCCCC" w:sz="1"/>
-              <w:bottom w:val="single" w:color="CCCCCC" w:sz="1"/>
-              <w:right w:val="single" w:color="CCCCCC" w:sz="1"/>
-            </w:tcBorders>
-            <w:shd w:fill="F5F5F5" w:val="clear"/>
-            <w:tcMar>
-              <w:top w:type="dxa" w:w="80"/>
-              <w:left w:type="dxa" w:w="120"/>
-              <w:bottom w:type="dxa" w:w="80"/>
-              <w:right w:type="dxa" w:w="120"/>
-            </w:tcMar>
-          </w:tcPr>
-          <w:p>
-            <w:r>
-              <w:rPr>
-                <w:rFonts w:ascii="Arial" w:cs="Arial" w:eastAsia="Arial" w:hAnsi="Arial"/>
-                <w:b w:val="false"/>
-                <w:bCs w:val="false"/>
-                <w:color w:val="333333"/>
-                <w:sz w:val="20"/>
-                <w:szCs w:val="20"/>
-              </w:rPr>
-              <w:t xml:space="preserve">Pitch of the sidetone</w:t>
-            </w:r>
-          </w:p>
-        </w:tc>
-      </w:tr>
-      <w:tr>
-        <w:tc>
-          <w:tcPr>
-            <w:tcW w:type="dxa" w:w="3120"/>
-            <w:tcBorders>
-              <w:top w:val="single" w:color="CCCCCC" w:sz="1"/>
-              <w:left w:val="single" w:color="CCCCCC" w:sz="1"/>
-              <w:bottom w:val="single" w:color="CCCCCC" w:sz="1"/>
-              <w:right w:val="single" w:color="CCCCCC" w:sz="1"/>
-            </w:tcBorders>
-            <w:shd w:fill="F5F5F5" w:val="clear"/>
-            <w:tcMar>
-              <w:top w:type="dxa" w:w="80"/>
-              <w:left w:type="dxa" w:w="120"/>
-              <w:bottom w:type="dxa" w:w="80"/>
-              <w:right w:type="dxa" w:w="120"/>
-            </w:tcMar>
-          </w:tcPr>
-          <w:p>
-            <w:r>
-              <w:rPr>
-                <w:rFonts w:ascii="Arial" w:cs="Arial" w:eastAsia="Arial" w:hAnsi="Arial"/>
-                <w:b w:val="false"/>
-                <w:bCs w:val="false"/>
-                <w:color w:val="333333"/>
-                <w:sz w:val="20"/>
-                <w:szCs w:val="20"/>
-              </w:rPr>
-              <w:t xml:space="preserve">DELAY</w:t>
-            </w:r>
-          </w:p>
-        </w:tc>
-        <w:tc>
-          <w:tcPr>
-            <w:tcW w:type="dxa" w:w="3120"/>
-            <w:tcBorders>
-              <w:top w:val="single" w:color="CCCCCC" w:sz="1"/>
-              <w:left w:val="single" w:color="CCCCCC" w:sz="1"/>
-              <w:bottom w:val="single" w:color="CCCCCC" w:sz="1"/>
-              <w:right w:val="single" w:color="CCCCCC" w:sz="1"/>
-            </w:tcBorders>
-            <w:shd w:fill="F5F5F5" w:val="clear"/>
-            <w:tcMar>
-              <w:top w:type="dxa" w:w="80"/>
-              <w:left w:type="dxa" w:w="120"/>
-              <w:bottom w:type="dxa" w:w="80"/>
-              <w:right w:type="dxa" w:w="120"/>
-            </w:tcMar>
-          </w:tcPr>
-          <w:p>
-            <w:r>
-              <w:rPr>
-                <w:rFonts w:ascii="Arial" w:cs="Arial" w:eastAsia="Arial" w:hAnsi="Arial"/>
-                <w:b w:val="false"/>
-                <w:bCs w:val="false"/>
-                <w:color w:val="333333"/>
-                <w:sz w:val="20"/>
-                <w:szCs w:val="20"/>
-              </w:rPr>
-              <w:t xml:space="preserve">0.0–3.0 sec or AO</w:t>
-            </w:r>
-          </w:p>
-        </w:tc>
-        <w:tc>
-          <w:tcPr>
-            <w:tcW w:type="dxa" w:w="3120"/>
-            <w:tcBorders>
-              <w:top w:val="single" w:color="CCCCCC" w:sz="1"/>
-              <w:left w:val="single" w:color="CCCCCC" w:sz="1"/>
-              <w:bottom w:val="single" w:color="CCCCCC" w:sz="1"/>
-              <w:right w:val="single" w:color="CCCCCC" w:sz="1"/>
-            </w:tcBorders>
-            <w:shd w:fill="F5F5F5" w:val="clear"/>
-            <w:tcMar>
-              <w:top w:type="dxa" w:w="80"/>
-              <w:left w:type="dxa" w:w="120"/>
-              <w:bottom w:type="dxa" w:w="80"/>
-              <w:right w:type="dxa" w:w="120"/>
-            </w:tcMar>
-          </w:tcPr>
-          <w:p>
-            <w:r>
-              <w:rPr>
-                <w:rFonts w:ascii="Arial" w:cs="Arial" w:eastAsia="Arial" w:hAnsi="Arial"/>
-                <w:b w:val="false"/>
-                <w:bCs w:val="false"/>
-                <w:color w:val="333333"/>
-                <w:sz w:val="20"/>
-                <w:szCs w:val="20"/>
-              </w:rPr>
-              <w:t xml:space="preserve">How long before received chars appear</w:t>
-            </w:r>
-          </w:p>
-        </w:tc>
-      </w:tr>
-      <w:tr>
-        <w:tc>
-          <w:tcPr>
-            <w:tcW w:type="dxa" w:w="3120"/>
-            <w:tcBorders>
-              <w:top w:val="single" w:color="CCCCCC" w:sz="1"/>
-              <w:left w:val="single" w:color="CCCCCC" w:sz="1"/>
-              <w:bottom w:val="single" w:color="CCCCCC" w:sz="1"/>
-              <w:right w:val="single" w:color="CCCCCC" w:sz="1"/>
-            </w:tcBorders>
-            <w:shd w:fill="F5F5F5" w:val="clear"/>
-            <w:tcMar>
-              <w:top w:type="dxa" w:w="80"/>
-              <w:left w:type="dxa" w:w="120"/>
-              <w:bottom w:type="dxa" w:w="80"/>
-              <w:right w:type="dxa" w:w="120"/>
-            </w:tcMar>
-          </w:tcPr>
-          <w:p>
-            <w:r>
-              <w:rPr>
-                <w:rFonts w:ascii="Arial" w:cs="Arial" w:eastAsia="Arial" w:hAnsi="Arial"/>
-                <w:b w:val="false"/>
-                <w:bCs w:val="false"/>
-                <w:color w:val="333333"/>
-                <w:sz w:val="20"/>
-                <w:szCs w:val="20"/>
-              </w:rPr>
-              <w:t xml:space="preserve">VOL</w:t>
-            </w:r>
-          </w:p>
-        </w:tc>
-        <w:tc>
-          <w:tcPr>
-            <w:tcW w:type="dxa" w:w="3120"/>
-            <w:tcBorders>
-              <w:top w:val="single" w:color="CCCCCC" w:sz="1"/>
-              <w:left w:val="single" w:color="CCCCCC" w:sz="1"/>
-              <w:bottom w:val="single" w:color="CCCCCC" w:sz="1"/>
-              <w:right w:val="single" w:color="CCCCCC" w:sz="1"/>
-            </w:tcBorders>
-            <w:shd w:fill="F5F5F5" w:val="clear"/>
-            <w:tcMar>
-              <w:top w:type="dxa" w:w="80"/>
-              <w:left w:type="dxa" w:w="120"/>
-              <w:bottom w:type="dxa" w:w="80"/>
-              <w:right w:type="dxa" w:w="120"/>
-            </w:tcMar>
-          </w:tcPr>
-          <w:p>
-            <w:r>
-              <w:rPr>
-                <w:rFonts w:ascii="Arial" w:cs="Arial" w:eastAsia="Arial" w:hAnsi="Arial"/>
-                <w:b w:val="false"/>
-                <w:bCs w:val="false"/>
-                <w:color w:val="333333"/>
-                <w:sz w:val="20"/>
-                <w:szCs w:val="20"/>
-              </w:rPr>
-              <w:t xml:space="preserve">0–100%</w:t>
-            </w:r>
-          </w:p>
-        </w:tc>
-        <w:tc>
-          <w:tcPr>
-            <w:tcW w:type="dxa" w:w="3120"/>
-            <w:tcBorders>
-              <w:top w:val="single" w:color="CCCCCC" w:sz="1"/>
-              <w:left w:val="single" w:color="CCCCCC" w:sz="1"/>
-              <w:bottom w:val="single" w:color="CCCCCC" w:sz="1"/>
-              <w:right w:val="single" w:color="CCCCCC" w:sz="1"/>
-            </w:tcBorders>
-            <w:shd w:fill="F5F5F5" w:val="clear"/>
-            <w:tcMar>
-              <w:top w:type="dxa" w:w="80"/>
-              <w:left w:type="dxa" w:w="120"/>
-              <w:bottom w:type="dxa" w:w="80"/>
-              <w:right w:type="dxa" w:w="120"/>
-            </w:tcMar>
-          </w:tcPr>
-          <w:p>
-            <w:r>
-              <w:rPr>
-                <w:rFonts w:ascii="Arial" w:cs="Arial" w:eastAsia="Arial" w:hAnsi="Arial"/>
-                <w:b w:val="false"/>
-                <w:bCs w:val="false"/>
-                <w:color w:val="333333"/>
-                <w:sz w:val="20"/>
-                <w:szCs w:val="20"/>
-              </w:rPr>
-              <w:t xml:space="preserve">Speaker volume</w:t>
-            </w:r>
-          </w:p>
-        </w:tc>
-      </w:tr>
-      <w:tr>
-        <w:tc>
-          <w:tcPr>
-            <w:tcW w:type="dxa" w:w="3120"/>
-            <w:tcBorders>
-              <w:top w:val="single" w:color="CCCCCC" w:sz="1"/>
-              <w:left w:val="single" w:color="CCCCCC" w:sz="1"/>
-              <w:bottom w:val="single" w:color="CCCCCC" w:sz="1"/>
-              <w:right w:val="single" w:color="CCCCCC" w:sz="1"/>
-            </w:tcBorders>
-            <w:shd w:fill="F5F5F5" w:val="clear"/>
-            <w:tcMar>
-              <w:top w:type="dxa" w:w="80"/>
-              <w:left w:type="dxa" w:w="120"/>
-              <w:bottom w:type="dxa" w:w="80"/>
-              <w:right w:type="dxa" w:w="120"/>
-            </w:tcMar>
-          </w:tcPr>
-          <w:p>
-            <w:r>
-              <w:rPr>
-                <w:rFonts w:ascii="Arial" w:cs="Arial" w:eastAsia="Arial" w:hAnsi="Arial"/>
-                <w:b w:val="false"/>
-                <w:bCs w:val="false"/>
-                <w:color w:val="333333"/>
-                <w:sz w:val="20"/>
-                <w:szCs w:val="20"/>
-              </w:rPr>
-              <w:t xml:space="preserve">GAP</w:t>
-            </w:r>
-          </w:p>
-        </w:tc>
-        <w:tc>
-          <w:tcPr>
-            <w:tcW w:type="dxa" w:w="3120"/>
-            <w:tcBorders>
-              <w:top w:val="single" w:color="CCCCCC" w:sz="1"/>
-              <w:left w:val="single" w:color="CCCCCC" w:sz="1"/>
-              <w:bottom w:val="single" w:color="CCCCCC" w:sz="1"/>
-              <w:right w:val="single" w:color="CCCCCC" w:sz="1"/>
-            </w:tcBorders>
-            <w:shd w:fill="F5F5F5" w:val="clear"/>
-            <w:tcMar>
-              <w:top w:type="dxa" w:w="80"/>
-              <w:left w:type="dxa" w:w="120"/>
-              <w:bottom w:type="dxa" w:w="80"/>
-              <w:right w:type="dxa" w:w="120"/>
-            </w:tcMar>
-          </w:tcPr>
-          <w:p>
-            <w:r>
-              <w:rPr>
-                <w:rFonts w:ascii="Arial" w:cs="Arial" w:eastAsia="Arial" w:hAnsi="Arial"/>
-                <w:b w:val="false"/>
-                <w:bCs w:val="false"/>
-                <w:color w:val="333333"/>
-                <w:sz w:val="20"/>
-                <w:szCs w:val="20"/>
-              </w:rPr>
-              <w:t xml:space="preserve">OFF or 4–9</w:t>
-            </w:r>
-          </w:p>
-        </w:tc>
-        <w:tc>
-          <w:tcPr>
-            <w:tcW w:type="dxa" w:w="3120"/>
-            <w:tcBorders>
-              <w:top w:val="single" w:color="CCCCCC" w:sz="1"/>
-              <w:left w:val="single" w:color="CCCCCC" w:sz="1"/>
-              <w:bottom w:val="single" w:color="CCCCCC" w:sz="1"/>
-              <w:right w:val="single" w:color="CCCCCC" w:sz="1"/>
-            </w:tcBorders>
-            <w:shd w:fill="F5F5F5" w:val="clear"/>
-            <w:tcMar>
-              <w:top w:type="dxa" w:w="80"/>
-              <w:left w:type="dxa" w:w="120"/>
-              <w:bottom w:type="dxa" w:w="80"/>
-              <w:right w:type="dxa" w:w="120"/>
-            </w:tcMar>
-          </w:tcPr>
-          <w:p>
-            <w:r>
-              <w:rPr>
-                <w:rFonts w:ascii="Arial" w:cs="Arial" w:eastAsia="Arial" w:hAnsi="Arial"/>
-                <w:b w:val="false"/>
-                <w:bCs w:val="false"/>
-                <w:color w:val="333333"/>
-                <w:sz w:val="20"/>
-                <w:szCs w:val="20"/>
-              </w:rPr>
-              <w:t xml:space="preserve">Word spacing on the display</w:t>
+              <w:t xml:space="preserve">Toggle Iambic Mode A / Mode B — header shows A or B</w:t>
             </w:r>
           </w:p>
         </w:tc>
@@ -2150,7 +1351,7 @@
           <w:sz w:val="26"/>
           <w:szCs w:val="26"/>
         </w:rPr>
-        <w:t xml:space="preserve">3.3 Setting WPM and Farnsworth</w:t>
+        <w:t xml:space="preserve">3.3 Iambic Modes</w:t>
       </w:r>
     </w:p>
     <w:p>
@@ -2163,7 +1364,87 @@
           <w:sz w:val="22"/>
           <w:szCs w:val="22"/>
         </w:rPr>
-        <w:t xml:space="preserve">The WPM setting has two steps:</w:t>
+        <w:t xml:space="preserve">Mode A — keyer stops after the current element when both paddles are released. Most common mode.</w:t>
+      </w:r>
+    </w:p>
+    <w:p>
+      <w:pPr>
+        <w:spacing w:after="120"/>
+      </w:pPr>
+      <w:r>
+        <w:t xml:space="preserve"/>
+      </w:r>
+    </w:p>
+    <w:p>
+      <w:pPr>
+        <w:spacing w:after="120"/>
+      </w:pPr>
+      <w:r>
+        <w:rPr>
+          <w:rFonts w:ascii="Arial" w:cs="Arial" w:eastAsia="Arial" w:hAnsi="Arial"/>
+          <w:sz w:val="22"/>
+          <w:szCs w:val="22"/>
+        </w:rPr>
+        <w:t xml:space="preserve">Mode B — keyer sends one extra opposite element after both paddles are released. Some operators prefer this for smoother squeeze keying.</w:t>
+      </w:r>
+    </w:p>
+    <w:p>
+      <w:pPr>
+        <w:spacing w:after="120"/>
+      </w:pPr>
+      <w:r>
+        <w:t xml:space="preserve"/>
+      </w:r>
+    </w:p>
+    <w:p>
+      <w:pPr>
+        <w:spacing w:after="80" w:before="80"/>
+        <w:ind w:left="360"/>
+      </w:pPr>
+      <w:r>
+        <w:rPr>
+          <w:rFonts w:ascii="Arial" w:cs="Arial" w:eastAsia="Arial" w:hAnsi="Arial"/>
+          <w:b/>
+          <w:bCs/>
+          <w:color w:val="048A81"/>
+          <w:sz w:val="22"/>
+          <w:szCs w:val="22"/>
+        </w:rPr>
+        <w:t xml:space="preserve">TIP: </w:t>
+      </w:r>
+      <w:r>
+        <w:rPr>
+          <w:rFonts w:ascii="Arial" w:cs="Arial" w:eastAsia="Arial" w:hAnsi="Arial"/>
+          <w:i/>
+          <w:iCs/>
+          <w:sz w:val="22"/>
+          <w:szCs w:val="22"/>
+        </w:rPr>
+        <w:t xml:space="preserve">Mode A/B is saved and restored on power cycle.</w:t>
+      </w:r>
+    </w:p>
+    <w:p>
+      <w:pPr>
+        <w:spacing w:after="120"/>
+      </w:pPr>
+      <w:r>
+        <w:t xml:space="preserve"/>
+      </w:r>
+    </w:p>
+    <w:p>
+      <w:pPr>
+        <w:pStyle w:val="Heading2"/>
+      </w:pPr>
+      <w:r>
+        <w:rPr>
+          <w:rFonts w:ascii="Arial" w:cs="Arial" w:eastAsia="Arial" w:hAnsi="Arial"/>
+          <w:b/>
+          <w:bCs/>
+          <w:color w:val="048A81"/>
+          <w:sz w:val="26"/>
+          <w:szCs w:val="26"/>
+        </w:rPr>
+        <w:t xml:space="preserve">3.4 Setting WPM and Farnsworth</w:t>
       </w:r>
     </w:p>
     <w:p>
@@ -2181,7 +1462,7 @@
           <w:sz w:val="22"/>
           <w:szCs w:val="22"/>
         </w:rPr>
-        <w:t xml:space="preserve">Long press on WPM — status shows CHAR SPEED. Turn knob to set character speed.</w:t>
+        <w:t xml:space="preserve">Long press WPM — set character speed</w:t>
       </w:r>
     </w:p>
     <w:p>
@@ -2199,7 +1480,7 @@
           <w:sz w:val="22"/>
           <w:szCs w:val="22"/>
         </w:rPr>
-        <w:t xml:space="preserve">Short press — status shows FARNSWORTH. Turn knob to set effective gap speed.</w:t>
+        <w:t xml:space="preserve">Short press — set Farnsworth speed (4 WPM min, up to char speed)</w:t>
       </w:r>
     </w:p>
     <w:p>
@@ -2217,7 +1498,7 @@
           <w:sz w:val="22"/>
           <w:szCs w:val="22"/>
         </w:rPr>
-        <w:t xml:space="preserve">Short press again — exits edit. Header shows 25WPM (equal) or 25/10 (Farnsworth active).</w:t>
+        <w:t xml:space="preserve">Short press — exit. Header shows 25WPM or 25/10</w:t>
       </w:r>
     </w:p>
     <w:p>
@@ -2252,44 +1533,7 @@
           <w:sz w:val="22"/>
           <w:szCs w:val="22"/>
         </w:rPr>
-        <w:t xml:space="preserve">Farnsworth spacing sends characters at full speed but adds extra space between them. Great for learning — your ear gets used to real-speed characters while you have time to copy them.</w:t>
-      </w:r>
-    </w:p>
-    <w:p>
-      <w:pPr>
-        <w:spacing w:after="120"/>
-      </w:pPr>
-      <w:r>
-        <w:t xml:space="preserve"/>
-      </w:r>
-    </w:p>
-    <w:p>
-      <w:pPr>
-        <w:pStyle w:val="Heading2"/>
-      </w:pPr>
-      <w:r>
-        <w:rPr>
-          <w:rFonts w:ascii="Arial" w:cs="Arial" w:eastAsia="Arial" w:hAnsi="Arial"/>
-          <w:b/>
-          <w:bCs/>
-          <w:color w:val="048A81"/>
-          <w:sz w:val="26"/>
-          <w:szCs w:val="26"/>
-        </w:rPr>
-        <w:t xml:space="preserve">3.4 Paddle Reverse Button</w:t>
-      </w:r>
-    </w:p>
-    <w:p>
-      <w:pPr>
-        <w:spacing w:after="120"/>
-      </w:pPr>
-      <w:r>
-        <w:rPr>
-          <w:rFonts w:ascii="Arial" w:cs="Arial" w:eastAsia="Arial" w:hAnsi="Arial"/>
-          <w:sz w:val="22"/>
-          <w:szCs w:val="22"/>
-        </w:rPr>
-        <w:t xml:space="preserve">The small button on the side toggles dit/dah swap. If your paddle feels reversed, press this once to fix it. You can also swap dit/dah from the web page on your phone.</w:t>
+        <w:t xml:space="preserve">When using the iambic output to a radio with a built-in keyer, always set the radio's WPM to match your CHARACTER speed (first number). Farnsworth gaps are transparent to the radio and work correctly at any Farnsworth setting.</w:t>
       </w:r>
     </w:p>
     <w:p>
@@ -2313,7 +1557,7 @@
           <w:sz w:val="32"/>
           <w:szCs w:val="32"/>
         </w:rPr>
-        <w:t xml:space="preserve">4. Using Your Phone with the Keyer</w:t>
+        <w:t xml:space="preserve">4. Using Your Phone</w:t>
       </w:r>
     </w:p>
     <w:p>
@@ -2347,7 +1591,7 @@
           <w:sz w:val="22"/>
           <w:szCs w:val="22"/>
         </w:rPr>
-        <w:t xml:space="preserve">Power on the keyer and wait a few seconds for WiFi to start</w:t>
+        <w:t xml:space="preserve">Connect to WiFi network K0WLY-XXXX (XXXX matches unit ID on display)</w:t>
       </w:r>
     </w:p>
     <w:p>
@@ -2365,7 +1609,7 @@
           <w:sz w:val="22"/>
           <w:szCs w:val="22"/>
         </w:rPr>
-        <w:t xml:space="preserve">On your phone go to WiFi settings</w:t>
+        <w:t xml:space="preserve">No password required — tap Connect Anyway if warned about no internet</w:t>
       </w:r>
     </w:p>
     <w:p>
@@ -2383,7 +1627,82 @@
           <w:sz w:val="22"/>
           <w:szCs w:val="22"/>
         </w:rPr>
-        <w:t xml:space="preserve">Connect to the network named K0WLY-XXXX — where XXXX matches the unit ID on your display</w:t>
+        <w:t xml:space="preserve">Open browser — go to http://192.168.4.1</w:t>
+      </w:r>
+    </w:p>
+    <w:p>
+      <w:pPr>
+        <w:spacing w:after="120"/>
+      </w:pPr>
+      <w:r>
+        <w:t xml:space="preserve"/>
+      </w:r>
+    </w:p>
+    <w:p>
+      <w:pPr>
+        <w:pStyle w:val="Heading2"/>
+      </w:pPr>
+      <w:r>
+        <w:rPr>
+          <w:rFonts w:ascii="Arial" w:cs="Arial" w:eastAsia="Arial" w:hAnsi="Arial"/>
+          <w:b/>
+          <w:bCs/>
+          <w:color w:val="048A81"/>
+          <w:sz w:val="26"/>
+          <w:szCs w:val="26"/>
+        </w:rPr>
+        <w:t xml:space="preserve">4.2 Web Page</w:t>
+      </w:r>
+    </w:p>
+    <w:p>
+      <w:pPr>
+        <w:spacing w:after="120"/>
+      </w:pPr>
+      <w:r>
+        <w:rPr>
+          <w:rFonts w:ascii="Arial" w:cs="Arial" w:eastAsia="Arial" w:hAnsi="Arial"/>
+          <w:b/>
+          <w:bCs/>
+          <w:sz w:val="22"/>
+          <w:szCs w:val="22"/>
+        </w:rPr>
+        <w:t xml:space="preserve">Dit/Dah Swap (orange)</w:t>
+      </w:r>
+    </w:p>
+    <w:p>
+      <w:pPr>
+        <w:spacing w:after="120"/>
+      </w:pPr>
+      <w:r>
+        <w:rPr>
+          <w:rFonts w:ascii="Arial" w:cs="Arial" w:eastAsia="Arial" w:hAnsi="Arial"/>
+          <w:sz w:val="22"/>
+          <w:szCs w:val="22"/>
+        </w:rPr>
+        <w:t xml:space="preserve">Same as the hardware paddle reverse button.</w:t>
+      </w:r>
+    </w:p>
+    <w:p>
+      <w:pPr>
+        <w:spacing w:after="120"/>
+      </w:pPr>
+      <w:r>
+        <w:t xml:space="preserve"/>
+      </w:r>
+    </w:p>
+    <w:p>
+      <w:pPr>
+        <w:spacing w:after="120"/>
+      </w:pPr>
+      <w:r>
+        <w:rPr>
+          <w:rFonts w:ascii="Arial" w:cs="Arial" w:eastAsia="Arial" w:hAnsi="Arial"/>
+          <w:b/>
+          <w:bCs/>
+          <w:sz w:val="22"/>
+          <w:szCs w:val="22"/>
+        </w:rPr>
+        <w:t xml:space="preserve">Practice Files</w:t>
       </w:r>
     </w:p>
     <w:p>
@@ -2401,7 +1720,7 @@
           <w:sz w:val="22"/>
           <w:szCs w:val="22"/>
         </w:rPr>
-        <w:t xml:space="preserve">No password required — just tap to connect</w:t>
+        <w:t xml:space="preserve">Tap ▶ to play a file</w:t>
       </w:r>
     </w:p>
     <w:p>
@@ -2419,7 +1738,7 @@
           <w:sz w:val="22"/>
           <w:szCs w:val="22"/>
         </w:rPr>
-        <w:t xml:space="preserve">If your phone warns about no internet, tap ‘Connect Anyway’ or turn off ‘Avoid bad connections’ in WiFi settings</w:t>
+        <w:t xml:space="preserve">Tap ✕ to delete a file</w:t>
       </w:r>
     </w:p>
     <w:p>
@@ -2437,116 +1756,7 @@
           <w:sz w:val="22"/>
           <w:szCs w:val="22"/>
         </w:rPr>
-        <w:t xml:space="preserve">Open your browser and go to http://192.168.4.1</w:t>
-      </w:r>
-    </w:p>
-    <w:p>
-      <w:pPr>
-        <w:spacing w:after="120"/>
-      </w:pPr>
-      <w:r>
-        <w:t xml:space="preserve"/>
-      </w:r>
-    </w:p>
-    <w:p>
-      <w:pPr>
-        <w:pStyle w:val="Heading2"/>
-      </w:pPr>
-      <w:r>
-        <w:rPr>
-          <w:rFonts w:ascii="Arial" w:cs="Arial" w:eastAsia="Arial" w:hAnsi="Arial"/>
-          <w:b/>
-          <w:bCs/>
-          <w:color w:val="048A81"/>
-          <w:sz w:val="26"/>
-          <w:szCs w:val="26"/>
-        </w:rPr>
-        <w:t xml:space="preserve">4.2 Web Page Features</w:t>
-      </w:r>
-    </w:p>
-    <w:p>
-      <w:pPr>
-        <w:spacing w:after="120"/>
-      </w:pPr>
-      <w:r>
-        <w:rPr>
-          <w:rFonts w:ascii="Arial" w:cs="Arial" w:eastAsia="Arial" w:hAnsi="Arial"/>
-          <w:sz w:val="22"/>
-          <w:szCs w:val="22"/>
-        </w:rPr>
-        <w:t xml:space="preserve">The web page has four sections:</w:t>
-      </w:r>
-    </w:p>
-    <w:p>
-      <w:pPr>
-        <w:spacing w:after="120"/>
-      </w:pPr>
-      <w:r>
-        <w:t xml:space="preserve"/>
-      </w:r>
-    </w:p>
-    <w:p>
-      <w:pPr>
-        <w:spacing w:after="120"/>
-      </w:pPr>
-      <w:r>
-        <w:rPr>
-          <w:rFonts w:ascii="Arial" w:cs="Arial" w:eastAsia="Arial" w:hAnsi="Arial"/>
-          <w:b/>
-          <w:bCs/>
-          <w:sz w:val="22"/>
-          <w:szCs w:val="22"/>
-        </w:rPr>
-        <w:t xml:space="preserve">Dit/Dah Swap (orange button)</w:t>
-      </w:r>
-    </w:p>
-    <w:p>
-      <w:pPr>
-        <w:spacing w:after="120"/>
-      </w:pPr>
-      <w:r>
-        <w:rPr>
-          <w:rFonts w:ascii="Arial" w:cs="Arial" w:eastAsia="Arial" w:hAnsi="Arial"/>
-          <w:sz w:val="22"/>
-          <w:szCs w:val="22"/>
-        </w:rPr>
-        <w:t xml:space="preserve">Taps the same as the hardware paddle reverse button. Shows SWAPPED or NORMAL briefly after tapping.</w:t>
-      </w:r>
-    </w:p>
-    <w:p>
-      <w:pPr>
-        <w:spacing w:after="120"/>
-      </w:pPr>
-      <w:r>
-        <w:t xml:space="preserve"/>
-      </w:r>
-    </w:p>
-    <w:p>
-      <w:pPr>
-        <w:spacing w:after="120"/>
-      </w:pPr>
-      <w:r>
-        <w:rPr>
-          <w:rFonts w:ascii="Arial" w:cs="Arial" w:eastAsia="Arial" w:hAnsi="Arial"/>
-          <w:b/>
-          <w:bCs/>
-          <w:sz w:val="22"/>
-          <w:szCs w:val="22"/>
-        </w:rPr>
-        <w:t xml:space="preserve">Practice Files</w:t>
-      </w:r>
-    </w:p>
-    <w:p>
-      <w:pPr>
-        <w:spacing w:after="120"/>
-      </w:pPr>
-      <w:r>
-        <w:rPr>
-          <w:rFonts w:ascii="Arial" w:cs="Arial" w:eastAsia="Arial" w:hAnsi="Arial"/>
-          <w:sz w:val="22"/>
-          <w:szCs w:val="22"/>
-        </w:rPr>
-        <w:t xml:space="preserve">Lists all text files stored on the keyer. Tap ▶ to play a file, ✕ to delete it. File names display without .txt and with underscores as spaces — so cq_call.txt shows as ‘cq call’.</w:t>
+        <w:t xml:space="preserve">File names show without .txt, underscores as spaces</w:t>
       </w:r>
     </w:p>
     <w:p>
@@ -2587,7 +1797,7 @@
           <w:sz w:val="22"/>
           <w:szCs w:val="22"/>
         </w:rPr>
-        <w:t xml:space="preserve">Stop Playback — immediately stops and clears the buffer</w:t>
+        <w:t xml:space="preserve">Stop Playback — immediate stop, clears buffer</w:t>
       </w:r>
     </w:p>
     <w:p>
@@ -2605,7 +1815,7 @@
           <w:sz w:val="22"/>
           <w:szCs w:val="22"/>
         </w:rPr>
-        <w:t xml:space="preserve">Pause/Resume — pauses instantly and resumes from approximately the same position</w:t>
+        <w:t xml:space="preserve">Pause/Resume — instant pause, resumes from same position</w:t>
       </w:r>
     </w:p>
     <w:p>
@@ -2641,7 +1851,7 @@
           <w:sz w:val="22"/>
           <w:szCs w:val="22"/>
         </w:rPr>
-        <w:t xml:space="preserve">Tap Choose File, select a .txt file from your phone, then tap Upload. The file appears in the Practice Files list immediately.</w:t>
+        <w:t xml:space="preserve">Select any .txt file from your phone and tap Upload.</w:t>
       </w:r>
     </w:p>
     <w:p>
@@ -2665,20 +1875,7 @@
           <w:sz w:val="26"/>
           <w:szCs w:val="26"/>
         </w:rPr>
-        <w:t xml:space="preserve">4.3 Creating Practice Files</w:t>
-      </w:r>
-    </w:p>
-    <w:p>
-      <w:pPr>
-        <w:spacing w:after="120"/>
-      </w:pPr>
-      <w:r>
-        <w:rPr>
-          <w:rFonts w:ascii="Arial" w:cs="Arial" w:eastAsia="Arial" w:hAnsi="Arial"/>
-          <w:sz w:val="22"/>
-          <w:szCs w:val="22"/>
-        </w:rPr>
-        <w:t xml:space="preserve">Any plain text file works. Type your practice text in any notes app and save as .txt. A few tips:</w:t>
+        <w:t xml:space="preserve">4.3 Practice File Tips</w:t>
       </w:r>
     </w:p>
     <w:p>
@@ -2696,7 +1893,7 @@
           <w:sz w:val="22"/>
           <w:szCs w:val="22"/>
         </w:rPr>
-        <w:t xml:space="preserve">Use UPPER CASE or lower case — both work, the keyer converts to upper case automatically</w:t>
+        <w:t xml:space="preserve">Use plain text files (.txt)</w:t>
       </w:r>
     </w:p>
     <w:p>
@@ -2714,7 +1911,7 @@
           <w:sz w:val="22"/>
           <w:szCs w:val="22"/>
         </w:rPr>
-        <w:t xml:space="preserve">Use spaces between words — these become CW word gaps</w:t>
+        <w:t xml:space="preserve">Spaces between words become CW word gaps</w:t>
       </w:r>
     </w:p>
     <w:p>
@@ -2750,7 +1947,7 @@
           <w:sz w:val="22"/>
           <w:szCs w:val="22"/>
         </w:rPr>
-        <w:t xml:space="preserve">Commas, periods, question marks and other punctuation are sent as their Morse equivalents</w:t>
+        <w:t xml:space="preserve">Name files descriptively: cq_de_k0wly.txt → shows as 'cq de k0wly'</w:t>
       </w:r>
     </w:p>
     <w:p>
@@ -2768,42 +1965,7 @@
           <w:sz w:val="22"/>
           <w:szCs w:val="22"/>
         </w:rPr>
-        <w:t xml:space="preserve">Name files descriptively using underscores: cq_de_k0wly.txt, contest_exchange.txt</w:t>
-      </w:r>
-    </w:p>
-    <w:p>
-      <w:pPr>
-        <w:spacing w:after="120"/>
-      </w:pPr>
-      <w:r>
-        <w:t xml:space="preserve"/>
-      </w:r>
-    </w:p>
-    <w:p>
-      <w:pPr>
-        <w:spacing w:after="80" w:before="80"/>
-        <w:ind w:left="360"/>
-      </w:pPr>
-      <w:r>
-        <w:rPr>
-          <w:rFonts w:ascii="Arial" w:cs="Arial" w:eastAsia="Arial" w:hAnsi="Arial"/>
-          <w:b/>
-          <w:bCs/>
-          <w:color w:val="048A81"/>
-          <w:sz w:val="22"/>
-          <w:szCs w:val="22"/>
-        </w:rPr>
-        <w:t xml:space="preserve">TIP: </w:t>
-      </w:r>
-      <w:r>
-        <w:rPr>
-          <w:rFonts w:ascii="Arial" w:cs="Arial" w:eastAsia="Arial" w:hAnsi="Arial"/>
-          <w:i/>
-          <w:iCs/>
-          <w:sz w:val="22"/>
-          <w:szCs w:val="22"/>
-        </w:rPr>
-        <w:t xml:space="preserve">The keyer plays files at whatever WPM and Farnsworth speed you have set. Adjust speed before starting playback.</w:t>
+        <w:t xml:space="preserve">All punctuation and prosigns are supported</w:t>
       </w:r>
     </w:p>
     <w:p>
@@ -2840,7 +2002,7 @@
           <w:sz w:val="22"/>
           <w:szCs w:val="22"/>
         </w:rPr>
-        <w:t xml:space="preserve">When two keyer units are within WiFi range of each other, they auto-discover and show DUAL in green. No setup required.</w:t>
+        <w:t xml:space="preserve">Two units auto-discover each other and show DUAL in green. No setup needed.</w:t>
       </w:r>
     </w:p>
     <w:p>
@@ -2866,7 +2028,7 @@
           <w:sz w:val="22"/>
           <w:szCs w:val="22"/>
         </w:rPr>
-        <w:t xml:space="preserve">TX line (green) — shows what you are sending</w:t>
+        <w:t xml:space="preserve">TX line (green) — what you send</w:t>
       </w:r>
     </w:p>
     <w:p>
@@ -2884,7 +2046,7 @@
           <w:sz w:val="22"/>
           <w:szCs w:val="22"/>
         </w:rPr>
-        <w:t xml:space="preserve">RX line (cyan) — shows what the other station is sending</w:t>
+        <w:t xml:space="preserve">RX line (cyan) — what the other station sends</w:t>
       </w:r>
     </w:p>
     <w:p>
@@ -2902,7 +2064,7 @@
           <w:sz w:val="22"/>
           <w:szCs w:val="22"/>
         </w:rPr>
-        <w:t xml:space="preserve">Each unit plays everything at its own sidetone pitch — you can set different frequencies</w:t>
+        <w:t xml:space="preserve">Each unit plays at its own sidetone pitch</w:t>
       </w:r>
     </w:p>
     <w:p>
@@ -2920,7 +2082,7 @@
           <w:sz w:val="22"/>
           <w:szCs w:val="22"/>
         </w:rPr>
-        <w:t xml:space="preserve">Head copy delay applies to incoming characters on your display — audio always immediate</w:t>
+        <w:t xml:space="preserve">Head copy delay applies to incoming display only — audio always immediate</w:t>
       </w:r>
     </w:p>
     <w:p>
@@ -2945,19 +2107,6 @@
           <w:szCs w:val="26"/>
         </w:rPr>
         <w:t xml:space="preserve">5.1 Head Copy Delay</w:t>
-      </w:r>
-    </w:p>
-    <w:p>
-      <w:pPr>
-        <w:spacing w:after="120"/>
-      </w:pPr>
-      <w:r>
-        <w:rPr>
-          <w:rFonts w:ascii="Arial" w:cs="Arial" w:eastAsia="Arial" w:hAnsi="Arial"/>
-          <w:sz w:val="22"/>
-          <w:szCs w:val="22"/>
-        </w:rPr>
-        <w:t xml:space="preserve">Set DELAY to practice copying before looking at the answer:</w:t>
       </w:r>
     </w:p>
     <w:p>
@@ -2975,7 +2124,7 @@
           <w:sz w:val="22"/>
           <w:szCs w:val="22"/>
         </w:rPr>
-        <w:t xml:space="preserve">0.0s — characters appear immediately (normal operating mode)</w:t>
+        <w:t xml:space="preserve">0.0s — normal, characters appear immediately</w:t>
       </w:r>
     </w:p>
     <w:p>
@@ -2993,7 +2142,7 @@
           <w:sz w:val="22"/>
           <w:szCs w:val="22"/>
         </w:rPr>
-        <w:t xml:space="preserve">0.5s to 3.0s — characters appear after a delay. Try to copy in your head first.</w:t>
+        <w:t xml:space="preserve">0.5s–3.0s — try to copy before looking</w:t>
       </w:r>
     </w:p>
     <w:p>
@@ -3011,7 +2160,7 @@
           <w:sz w:val="22"/>
           <w:szCs w:val="22"/>
         </w:rPr>
-        <w:t xml:space="preserve">AO (Audio Only) — incoming characters never appear. Pure audio copy. RX line shows [Audio Only] in orange.</w:t>
+        <w:t xml:space="preserve">AO (Audio Only) — characters never appear, pure audio copy</w:t>
       </w:r>
     </w:p>
     <w:p>
@@ -3024,37 +2173,18 @@
     </w:p>
     <w:p>
       <w:pPr>
-        <w:spacing w:after="80" w:before="80"/>
-        <w:ind w:left="360"/>
+        <w:pStyle w:val="Heading1"/>
       </w:pPr>
       <w:r>
         <w:rPr>
           <w:rFonts w:ascii="Arial" w:cs="Arial" w:eastAsia="Arial" w:hAnsi="Arial"/>
           <w:b/>
           <w:bCs/>
-          <w:color w:val="048A81"/>
-          <w:sz w:val="22"/>
-          <w:szCs w:val="22"/>
-        </w:rPr>
-        <w:t xml:space="preserve">TIP: </w:t>
-      </w:r>
-      <w:r>
-        <w:rPr>
-          <w:rFonts w:ascii="Arial" w:cs="Arial" w:eastAsia="Arial" w:hAnsi="Arial"/>
-          <w:i/>
-          <w:iCs/>
-          <w:sz w:val="22"/>
-          <w:szCs w:val="22"/>
-        </w:rPr>
-        <w:t xml:space="preserve">Start with a short delay and increase it as your copying improves. This is one of the most effective ways to build head copy skill.</w:t>
-      </w:r>
-    </w:p>
-    <w:p>
-      <w:pPr>
-        <w:spacing w:after="120"/>
-      </w:pPr>
-      <w:r>
-        <w:t xml:space="preserve"/>
+          <w:color w:val="2E4057"/>
+          <w:sz w:val="32"/>
+          <w:szCs w:val="32"/>
+        </w:rPr>
+        <w:t xml:space="preserve">6. Connecting to a Transceiver</w:t>
       </w:r>
     </w:p>
     <w:p>
@@ -3070,7 +2200,7 @@
           <w:sz w:val="26"/>
           <w:szCs w:val="26"/>
         </w:rPr>
-        <w:t xml:space="preserve">5.2 Word Gap Display</w:t>
+        <w:t xml:space="preserve">6.1 Key Output</w:t>
       </w:r>
     </w:p>
     <w:p>
@@ -3083,7 +2213,44 @@
           <w:sz w:val="22"/>
           <w:szCs w:val="22"/>
         </w:rPr>
-        <w:t xml:space="preserve">The GAP setting controls whether spaces appear between words on the TX and RX lines:</w:t>
+        <w:t xml:space="preserve">Connects to your radio's straight key input. Keyer controls exact timing.</w:t>
+      </w:r>
+    </w:p>
+    <w:p>
+      <w:pPr>
+        <w:spacing w:after="120"/>
+      </w:pPr>
+      <w:r>
+        <w:t xml:space="preserve"/>
+      </w:r>
+    </w:p>
+    <w:p>
+      <w:pPr>
+        <w:pStyle w:val="Heading2"/>
+      </w:pPr>
+      <w:r>
+        <w:rPr>
+          <w:rFonts w:ascii="Arial" w:cs="Arial" w:eastAsia="Arial" w:hAnsi="Arial"/>
+          <w:b/>
+          <w:bCs/>
+          <w:color w:val="048A81"/>
+          <w:sz w:val="26"/>
+          <w:szCs w:val="26"/>
+        </w:rPr>
+        <w:t xml:space="preserve">6.2 Iambic Output</w:t>
+      </w:r>
+    </w:p>
+    <w:p>
+      <w:pPr>
+        <w:spacing w:after="120"/>
+      </w:pPr>
+      <w:r>
+        <w:rPr>
+          <w:rFonts w:ascii="Arial" w:cs="Arial" w:eastAsia="Arial" w:hAnsi="Arial"/>
+          <w:sz w:val="22"/>
+          <w:szCs w:val="22"/>
+        </w:rPr>
+        <w:t xml:space="preserve">For radios with built-in keyers (e.g. Xiegu G90). 3.5mm stereo jack:</w:t>
       </w:r>
     </w:p>
     <w:p>
@@ -3101,7 +2268,7 @@
           <w:sz w:val="22"/>
           <w:szCs w:val="22"/>
         </w:rPr>
-        <w:t xml:space="preserve">GAP:OFF — no spaces inserted, characters run together</w:t>
+        <w:t xml:space="preserve">Tip — DIT</w:t>
       </w:r>
     </w:p>
     <w:p>
@@ -3119,7 +2286,7 @@
           <w:sz w:val="22"/>
           <w:szCs w:val="22"/>
         </w:rPr>
-        <w:t xml:space="preserve">GAP:4 through GAP:9 — a space appears after silence of that many dit lengths</w:t>
+        <w:t xml:space="preserve">Ring — DAH</w:t>
       </w:r>
     </w:p>
     <w:p>
@@ -3137,151 +2304,7 @@
           <w:sz w:val="22"/>
           <w:szCs w:val="22"/>
         </w:rPr>
-        <w:t xml:space="preserve">Lower numbers = tighter, higher numbers = more forgiving for slower senders</w:t>
-      </w:r>
-    </w:p>
-    <w:p>
-      <w:pPr>
-        <w:spacing w:after="120"/>
-      </w:pPr>
-      <w:r>
-        <w:t xml:space="preserve"/>
-      </w:r>
-    </w:p>
-    <w:p>
-      <w:pPr>
-        <w:pStyle w:val="Heading1"/>
-      </w:pPr>
-      <w:r>
-        <w:rPr>
-          <w:rFonts w:ascii="Arial" w:cs="Arial" w:eastAsia="Arial" w:hAnsi="Arial"/>
-          <w:b/>
-          <w:bCs/>
-          <w:color w:val="2E4057"/>
-          <w:sz w:val="32"/>
-          <w:szCs w:val="32"/>
-        </w:rPr>
-        <w:t xml:space="preserve">6. Connecting to a Transceiver</w:t>
-      </w:r>
-    </w:p>
-    <w:p>
-      <w:pPr>
-        <w:pStyle w:val="Heading2"/>
-      </w:pPr>
-      <w:r>
-        <w:rPr>
-          <w:rFonts w:ascii="Arial" w:cs="Arial" w:eastAsia="Arial" w:hAnsi="Arial"/>
-          <w:b/>
-          <w:bCs/>
-          <w:color w:val="048A81"/>
-          <w:sz w:val="26"/>
-          <w:szCs w:val="26"/>
-        </w:rPr>
-        <w:t xml:space="preserve">6.1 Key Output</w:t>
-      </w:r>
-    </w:p>
-    <w:p>
-      <w:pPr>
-        <w:spacing w:after="120"/>
-      </w:pPr>
-      <w:r>
-        <w:rPr>
-          <w:rFonts w:ascii="Arial" w:cs="Arial" w:eastAsia="Arial" w:hAnsi="Arial"/>
-          <w:sz w:val="22"/>
-          <w:szCs w:val="22"/>
-        </w:rPr>
-        <w:t xml:space="preserve">The KEY OUT jack connects to your radio's straight key or external key input via a 3.5mm mono or TRS cable. The keyer drives this line in sync with your paddle. Use this for radios without a built-in keyer, or when you want the keyer to control the radio's timing exactly.</w:t>
-      </w:r>
-    </w:p>
-    <w:p>
-      <w:pPr>
-        <w:spacing w:after="120"/>
-      </w:pPr>
-      <w:r>
-        <w:t xml:space="preserve"/>
-      </w:r>
-    </w:p>
-    <w:p>
-      <w:pPr>
-        <w:pStyle w:val="Heading2"/>
-      </w:pPr>
-      <w:r>
-        <w:rPr>
-          <w:rFonts w:ascii="Arial" w:cs="Arial" w:eastAsia="Arial" w:hAnsi="Arial"/>
-          <w:b/>
-          <w:bCs/>
-          <w:color w:val="048A81"/>
-          <w:sz w:val="26"/>
-          <w:szCs w:val="26"/>
-        </w:rPr>
-        <w:t xml:space="preserve">6.2 Iambic Output (for radios with built-in keyers)</w:t>
-      </w:r>
-    </w:p>
-    <w:p>
-      <w:pPr>
-        <w:spacing w:after="120"/>
-      </w:pPr>
-      <w:r>
-        <w:rPr>
-          <w:rFonts w:ascii="Arial" w:cs="Arial" w:eastAsia="Arial" w:hAnsi="Arial"/>
-          <w:sz w:val="22"/>
-          <w:szCs w:val="22"/>
-        </w:rPr>
-        <w:t xml:space="preserve">The IAMBIC OUT jack is a 3.5mm stereo connection for radios that have a built-in keyer and accept a paddle input directly (such as the Xiegu G90):</w:t>
-      </w:r>
-    </w:p>
-    <w:p>
-      <w:pPr>
-        <w:pStyle w:val="ListParagraph"/>
-        <w:numPr>
-          <w:ilvl w:val="0"/>
-          <w:numId w:val="2"/>
-        </w:numPr>
-        <w:spacing w:after="80"/>
-      </w:pPr>
-      <w:r>
-        <w:rPr>
-          <w:rFonts w:ascii="Arial" w:cs="Arial" w:eastAsia="Arial" w:hAnsi="Arial"/>
-          <w:sz w:val="22"/>
-          <w:szCs w:val="22"/>
-        </w:rPr>
-        <w:t xml:space="preserve">Tip — DIT signal</w:t>
-      </w:r>
-    </w:p>
-    <w:p>
-      <w:pPr>
-        <w:pStyle w:val="ListParagraph"/>
-        <w:numPr>
-          <w:ilvl w:val="0"/>
-          <w:numId w:val="2"/>
-        </w:numPr>
-        <w:spacing w:after="80"/>
-      </w:pPr>
-      <w:r>
-        <w:rPr>
-          <w:rFonts w:ascii="Arial" w:cs="Arial" w:eastAsia="Arial" w:hAnsi="Arial"/>
-          <w:sz w:val="22"/>
-          <w:szCs w:val="22"/>
-        </w:rPr>
-        <w:t xml:space="preserve">Ring — DAH signal</w:t>
-      </w:r>
-    </w:p>
-    <w:p>
-      <w:pPr>
-        <w:pStyle w:val="ListParagraph"/>
-        <w:numPr>
-          <w:ilvl w:val="0"/>
-          <w:numId w:val="2"/>
-        </w:numPr>
-        <w:spacing w:after="80"/>
-      </w:pPr>
-      <w:r>
-        <w:rPr>
-          <w:rFonts w:ascii="Arial" w:cs="Arial" w:eastAsia="Arial" w:hAnsi="Arial"/>
-          <w:sz w:val="22"/>
-          <w:szCs w:val="22"/>
-        </w:rPr>
-        <w:t xml:space="preserve">Sleeve — Ground</w:t>
+        <w:t xml:space="preserve">Sleeve — GND</w:t>
       </w:r>
     </w:p>
     <w:p>
@@ -3316,28 +2339,7 @@
           <w:sz w:val="22"/>
           <w:szCs w:val="22"/>
         </w:rPr>
-        <w:t xml:space="preserve">When using the iambic output, the radio's built-in keyer controls the sending speed — set your radio's WPM to match the keyer's WPM for best results.</w:t>
-      </w:r>
-    </w:p>
-    <w:p>
-      <w:pPr>
-        <w:spacing w:after="120"/>
-      </w:pPr>
-      <w:r>
-        <w:t xml:space="preserve"/>
-      </w:r>
-    </w:p>
-    <w:p>
-      <w:pPr>
-        <w:spacing w:after="120"/>
-      </w:pPr>
-      <w:r>
-        <w:rPr>
-          <w:rFonts w:ascii="Arial" w:cs="Arial" w:eastAsia="Arial" w:hAnsi="Arial"/>
-          <w:sz w:val="22"/>
-          <w:szCs w:val="22"/>
-        </w:rPr>
-        <w:t xml:space="preserve">When playing a text file, the iambic output is also driven — so your radio will transmit the file content automatically.</w:t>
+        <w:t xml:space="preserve">Set the radio's WPM to match the keyer's character speed. With Farnsworth (e.g. 25/10) set the radio to 25 WPM. This applies to all radios with built-in keyers.</w:t>
       </w:r>
     </w:p>
     <w:p>
@@ -3567,7 +2569,7 @@
                 <w:sz w:val="20"/>
                 <w:szCs w:val="20"/>
               </w:rPr>
-              <w:t xml:space="preserve">Off (same as char speed)</w:t>
+              <w:t xml:space="preserve">Off</w:t>
             </w:r>
           </w:p>
         </w:tc>
@@ -3856,7 +2858,7 @@
                 <w:sz w:val="20"/>
                 <w:szCs w:val="20"/>
               </w:rPr>
-              <w:t xml:space="preserve">Paddle Mode</w:t>
+              <w:t xml:space="preserve">Iambic Mode</w:t>
             </w:r>
           </w:p>
         </w:tc>
@@ -3887,7 +2889,7 @@
                 <w:sz w:val="20"/>
                 <w:szCs w:val="20"/>
               </w:rPr>
-              <w:t xml:space="preserve">Iambic</w:t>
+              <w:t xml:space="preserve">Mode A</w:t>
             </w:r>
           </w:p>
         </w:tc>
@@ -3957,41 +2959,6 @@
         </w:tc>
       </w:tr>
     </w:tbl>
-    <w:p>
-      <w:pPr>
-        <w:spacing w:after="120"/>
-      </w:pPr>
-      <w:r>
-        <w:t xml:space="preserve"/>
-      </w:r>
-    </w:p>
-    <w:p>
-      <w:pPr>
-        <w:spacing w:after="80" w:before="80"/>
-        <w:ind w:left="360"/>
-      </w:pPr>
-      <w:r>
-        <w:rPr>
-          <w:rFonts w:ascii="Arial" w:cs="Arial" w:eastAsia="Arial" w:hAnsi="Arial"/>
-          <w:b/>
-          <w:bCs/>
-          <w:color w:val="C0392B"/>
-          <w:sz w:val="22"/>
-          <w:szCs w:val="22"/>
-        </w:rPr>
-        <w:t xml:space="preserve">NOTE: </w:t>
-      </w:r>
-      <w:r>
-        <w:rPr>
-          <w:rFonts w:ascii="Arial" w:cs="Arial" w:eastAsia="Arial" w:hAnsi="Arial"/>
-          <w:i/>
-          <w:iCs/>
-          <w:sz w:val="22"/>
-          <w:szCs w:val="22"/>
-        </w:rPr>
-        <w:t xml:space="preserve">All settings are saved automatically when you adjust them. They restore when you power on again.</w:t>
-      </w:r>
-    </w:p>
     <w:p>
       <w:pPr>
         <w:spacing w:after="120"/>
@@ -4013,28 +2980,7 @@
           <w:sz w:val="32"/>
           <w:szCs w:val="32"/>
         </w:rPr>
-        <w:t xml:space="preserve">8. Updating the Firmware</w:t>
-      </w:r>
-    </w:p>
-    <w:p>
-      <w:pPr>
-        <w:spacing w:after="120"/>
-      </w:pPr>
-      <w:r>
-        <w:rPr>
-          <w:rFonts w:ascii="Arial" w:cs="Arial" w:eastAsia="Arial" w:hAnsi="Arial"/>
-          <w:sz w:val="22"/>
-          <w:szCs w:val="22"/>
-        </w:rPr>
-        <w:t xml:space="preserve">New firmware versions are released on GitHub at github.com/Cowlacious/k0wly-cw-keyer. Each release includes a firmware.bin file you can use to update without installing any development tools.</w:t>
-      </w:r>
-    </w:p>
-    <w:p>
-      <w:pPr>
-        <w:spacing w:after="120"/>
-      </w:pPr>
-      <w:r>
-        <w:t xml:space="preserve"/>
+        <w:t xml:space="preserve">8. Updating Firmware</w:t>
       </w:r>
     </w:p>
     <w:p>
@@ -4050,7 +2996,7 @@
           <w:sz w:val="26"/>
           <w:szCs w:val="26"/>
         </w:rPr>
-        <w:t xml:space="preserve">8.1 Windows — Espressif Flash Download Tool (easiest)</w:t>
+        <w:t xml:space="preserve">8.1 Windows — Espressif Flash Download Tool</w:t>
       </w:r>
     </w:p>
     <w:p>
@@ -4068,7 +3014,7 @@
           <w:sz w:val="22"/>
           <w:szCs w:val="22"/>
         </w:rPr>
-        <w:t xml:space="preserve">Download Flash Download Tools from espressif.com/en/support/download/other-tools</w:t>
+        <w:t xml:space="preserve">Download from espressif.com/en/support/download/other-tools</w:t>
       </w:r>
     </w:p>
     <w:p>
@@ -4086,7 +3032,7 @@
           <w:sz w:val="22"/>
           <w:szCs w:val="22"/>
         </w:rPr>
-        <w:t xml:space="preserve">Run flash_download_tool.exe and select ESP32-S3</w:t>
+        <w:t xml:space="preserve">Select ESP32-S3, browse to firmware.bin, set address 0x10000</w:t>
       </w:r>
     </w:p>
     <w:p>
@@ -4104,7 +3050,7 @@
           <w:sz w:val="22"/>
           <w:szCs w:val="22"/>
         </w:rPr>
-        <w:t xml:space="preserve">Click the … button and select your firmware.bin file</w:t>
+        <w:t xml:space="preserve">Select COM port, baud 921600, click START</w:t>
       </w:r>
     </w:p>
     <w:p>
@@ -4122,7 +3068,81 @@
           <w:sz w:val="22"/>
           <w:szCs w:val="22"/>
         </w:rPr>
-        <w:t xml:space="preserve">Set the address to 0x10000</w:t>
+        <w:t xml:space="preserve">If fails: hold BOOT, press RST, release BOOT, click START</w:t>
+      </w:r>
+    </w:p>
+    <w:p>
+      <w:pPr>
+        <w:spacing w:after="120"/>
+      </w:pPr>
+      <w:r>
+        <w:t xml:space="preserve"/>
+      </w:r>
+    </w:p>
+    <w:p>
+      <w:pPr>
+        <w:pStyle w:val="Heading2"/>
+      </w:pPr>
+      <w:r>
+        <w:rPr>
+          <w:rFonts w:ascii="Arial" w:cs="Arial" w:eastAsia="Arial" w:hAnsi="Arial"/>
+          <w:b/>
+          <w:bCs/>
+          <w:color w:val="048A81"/>
+          <w:sz w:val="26"/>
+          <w:szCs w:val="26"/>
+        </w:rPr>
+        <w:t xml:space="preserve">8.2 Mac/Linux — esptool.py</w:t>
+      </w:r>
+    </w:p>
+    <w:p>
+      <w:pPr>
+        <w:spacing w:after="120"/>
+      </w:pPr>
+      <w:r>
+        <w:rPr>
+          <w:rFonts w:ascii="Courier New" w:cs="Courier New" w:eastAsia="Courier New" w:hAnsi="Courier New"/>
+          <w:sz w:val="20"/>
+          <w:szCs w:val="20"/>
+        </w:rPr>
+        <w:t xml:space="preserve">pip install esptool</w:t>
+      </w:r>
+    </w:p>
+    <w:p>
+      <w:pPr>
+        <w:spacing w:after="120"/>
+      </w:pPr>
+      <w:r>
+        <w:rPr>
+          <w:rFonts w:ascii="Courier New" w:cs="Courier New" w:eastAsia="Courier New" w:hAnsi="Courier New"/>
+          <w:sz w:val="18"/>
+          <w:szCs w:val="18"/>
+        </w:rPr>
+        <w:t xml:space="preserve">esptool.py --port /dev/tty.usbmodem101 --baud 921600 write_flash 0x10000 firmware.bin</w:t>
+      </w:r>
+    </w:p>
+    <w:p>
+      <w:pPr>
+        <w:spacing w:after="120"/>
+      </w:pPr>
+      <w:r>
+        <w:t xml:space="preserve"/>
+      </w:r>
+    </w:p>
+    <w:p>
+      <w:pPr>
+        <w:pStyle w:val="Heading1"/>
+      </w:pPr>
+      <w:r>
+        <w:rPr>
+          <w:rFonts w:ascii="Arial" w:cs="Arial" w:eastAsia="Arial" w:hAnsi="Arial"/>
+          <w:b/>
+          <w:bCs/>
+          <w:color w:val="2E4057"/>
+          <w:sz w:val="32"/>
+          <w:szCs w:val="32"/>
+        </w:rPr>
+        <w:t xml:space="preserve">9. Practice Tips</w:t>
       </w:r>
     </w:p>
     <w:p>
@@ -4140,7 +3160,7 @@
           <w:sz w:val="22"/>
           <w:szCs w:val="22"/>
         </w:rPr>
-        <w:t xml:space="preserve">Select your COM port from the dropdown (check Device Manager if unsure)</w:t>
+        <w:t xml:space="preserve">Start at comfortable speed — accuracy beats speed</w:t>
       </w:r>
     </w:p>
     <w:p>
@@ -4158,7 +3178,7 @@
           <w:sz w:val="22"/>
           <w:szCs w:val="22"/>
         </w:rPr>
-        <w:t xml:space="preserve">Set baud rate to 921600 and click START</w:t>
+        <w:t xml:space="preserve">Use Farnsworth — char speed 20-25 WPM, effective 5-10 WPM</w:t>
       </w:r>
     </w:p>
     <w:p>
@@ -4176,116 +3196,61 @@
           <w:sz w:val="22"/>
           <w:szCs w:val="22"/>
         </w:rPr>
-        <w:t xml:space="preserve">If connection fails: hold BOOT button, press and release RST, release BOOT, then click START</w:t>
-      </w:r>
-    </w:p>
-    <w:p>
-      <w:pPr>
-        <w:spacing w:after="120"/>
-      </w:pPr>
-      <w:r>
-        <w:t xml:space="preserve"/>
-      </w:r>
-    </w:p>
-    <w:p>
-      <w:pPr>
-        <w:pStyle w:val="Heading2"/>
-      </w:pPr>
-      <w:r>
-        <w:rPr>
-          <w:rFonts w:ascii="Arial" w:cs="Arial" w:eastAsia="Arial" w:hAnsi="Arial"/>
-          <w:b/>
-          <w:bCs/>
-          <w:color w:val="048A81"/>
-          <w:sz w:val="26"/>
-          <w:szCs w:val="26"/>
-        </w:rPr>
-        <w:t xml:space="preserve">8.2 Mac and Linux — esptool.py</w:t>
-      </w:r>
-    </w:p>
-    <w:p>
-      <w:pPr>
-        <w:spacing w:after="120"/>
-      </w:pPr>
-      <w:r>
-        <w:rPr>
-          <w:rFonts w:ascii="Arial" w:cs="Arial" w:eastAsia="Arial" w:hAnsi="Arial"/>
-          <w:b/>
-          <w:bCs/>
-          <w:sz w:val="22"/>
-          <w:szCs w:val="22"/>
-        </w:rPr>
-        <w:t xml:space="preserve">Install esptool (requires Python):</w:t>
-      </w:r>
-    </w:p>
-    <w:p>
-      <w:pPr>
-        <w:spacing w:after="120"/>
-      </w:pPr>
-      <w:r>
-        <w:rPr>
-          <w:rFonts w:ascii="Courier New" w:cs="Courier New" w:eastAsia="Courier New" w:hAnsi="Courier New"/>
-          <w:sz w:val="20"/>
-          <w:szCs w:val="20"/>
-        </w:rPr>
-        <w:t xml:space="preserve">pip install esptool</w:t>
-      </w:r>
-    </w:p>
-    <w:p>
-      <w:pPr>
-        <w:spacing w:after="120"/>
-      </w:pPr>
-      <w:r>
-        <w:t xml:space="preserve"/>
-      </w:r>
-    </w:p>
-    <w:p>
-      <w:pPr>
-        <w:spacing w:after="120"/>
-      </w:pPr>
-      <w:r>
-        <w:rPr>
-          <w:rFonts w:ascii="Arial" w:cs="Arial" w:eastAsia="Arial" w:hAnsi="Arial"/>
-          <w:b/>
-          <w:bCs/>
-          <w:sz w:val="22"/>
-          <w:szCs w:val="22"/>
-        </w:rPr>
-        <w:t xml:space="preserve">Flash the firmware:</w:t>
-      </w:r>
-    </w:p>
-    <w:p>
-      <w:pPr>
-        <w:spacing w:after="120"/>
-      </w:pPr>
-      <w:r>
-        <w:rPr>
-          <w:rFonts w:ascii="Courier New" w:cs="Courier New" w:eastAsia="Courier New" w:hAnsi="Courier New"/>
-          <w:sz w:val="18"/>
-          <w:szCs w:val="18"/>
-        </w:rPr>
-        <w:t xml:space="preserve">esptool.py --port /dev/tty.usbmodem101 --baud 921600 write_flash 0x10000 firmware.bin</w:t>
-      </w:r>
-    </w:p>
-    <w:p>
-      <w:pPr>
-        <w:spacing w:after="120"/>
-      </w:pPr>
-      <w:r>
-        <w:t xml:space="preserve"/>
-      </w:r>
-    </w:p>
-    <w:p>
-      <w:pPr>
-        <w:spacing w:after="120"/>
-      </w:pPr>
-      <w:r>
-        <w:rPr>
-          <w:rFonts w:ascii="Arial" w:cs="Arial" w:eastAsia="Arial" w:hAnsi="Arial"/>
-          <w:sz w:val="22"/>
-          <w:szCs w:val="22"/>
-        </w:rPr>
-        <w:t xml:space="preserve">Replace /dev/tty.usbmodem101 with your actual port. On Linux it is typically /dev/ttyACM0.</w:t>
+        <w:t xml:space="preserve">Increase head copy delay gradually toward Audio Only</w:t>
+      </w:r>
+    </w:p>
+    <w:p>
+      <w:pPr>
+        <w:pStyle w:val="ListParagraph"/>
+        <w:numPr>
+          <w:ilvl w:val="0"/>
+          <w:numId w:val="2"/>
+        </w:numPr>
+        <w:spacing w:after="80"/>
+      </w:pPr>
+      <w:r>
+        <w:rPr>
+          <w:rFonts w:ascii="Arial" w:cs="Arial" w:eastAsia="Arial" w:hAnsi="Arial"/>
+          <w:sz w:val="22"/>
+          <w:szCs w:val="22"/>
+        </w:rPr>
+        <w:t xml:space="preserve">Practice with real QSO text, call signs, contest exchanges</w:t>
+      </w:r>
+    </w:p>
+    <w:p>
+      <w:pPr>
+        <w:pStyle w:val="ListParagraph"/>
+        <w:numPr>
+          <w:ilvl w:val="0"/>
+          <w:numId w:val="2"/>
+        </w:numPr>
+        <w:spacing w:after="80"/>
+      </w:pPr>
+      <w:r>
+        <w:rPr>
+          <w:rFonts w:ascii="Arial" w:cs="Arial" w:eastAsia="Arial" w:hAnsi="Arial"/>
+          <w:sz w:val="22"/>
+          <w:szCs w:val="22"/>
+        </w:rPr>
+        <w:t xml:space="preserve">Try both Iambic Mode A and B — find which feels more natural</w:t>
+      </w:r>
+    </w:p>
+    <w:p>
+      <w:pPr>
+        <w:pStyle w:val="ListParagraph"/>
+        <w:numPr>
+          <w:ilvl w:val="0"/>
+          <w:numId w:val="2"/>
+        </w:numPr>
+        <w:spacing w:after="80"/>
+      </w:pPr>
+      <w:r>
+        <w:rPr>
+          <w:rFonts w:ascii="Arial" w:cs="Arial" w:eastAsia="Arial" w:hAnsi="Arial"/>
+          <w:sz w:val="22"/>
+          <w:szCs w:val="22"/>
+        </w:rPr>
+        <w:t xml:space="preserve">Two-unit practice is the closest thing to a real QSO</w:t>
       </w:r>
     </w:p>
     <w:p>
@@ -4309,7 +3274,688 @@
           <w:sz w:val="32"/>
           <w:szCs w:val="32"/>
         </w:rPr>
-        <w:t xml:space="preserve">9. Morse Code Reference</w:t>
+        <w:t xml:space="preserve">10. Quick Reference</w:t>
+      </w:r>
+    </w:p>
+    <w:tbl>
+      <w:tblPr>
+        <w:tblW w:type="dxa" w:w="9360"/>
+        <w:tblBorders>
+          <w:top w:val="single" w:color="auto" w:sz="4"/>
+          <w:left w:val="single" w:color="auto" w:sz="4"/>
+          <w:bottom w:val="single" w:color="auto" w:sz="4"/>
+          <w:right w:val="single" w:color="auto" w:sz="4"/>
+          <w:insideH w:val="single" w:color="auto" w:sz="4"/>
+          <w:insideV w:val="single" w:color="auto" w:sz="4"/>
+        </w:tblBorders>
+      </w:tblPr>
+      <w:tblGrid>
+        <w:gridCol w:w="4680"/>
+        <w:gridCol w:w="4680"/>
+      </w:tblGrid>
+      <w:tr>
+        <w:tc>
+          <w:tcPr>
+            <w:tcW w:type="dxa" w:w="4680"/>
+            <w:tcBorders>
+              <w:top w:val="single" w:color="CCCCCC" w:sz="1"/>
+              <w:left w:val="single" w:color="CCCCCC" w:sz="1"/>
+              <w:bottom w:val="single" w:color="CCCCCC" w:sz="1"/>
+              <w:right w:val="single" w:color="CCCCCC" w:sz="1"/>
+            </w:tcBorders>
+            <w:shd w:fill="2E4057" w:val="clear"/>
+            <w:tcMar>
+              <w:top w:type="dxa" w:w="80"/>
+              <w:left w:type="dxa" w:w="120"/>
+              <w:bottom w:type="dxa" w:w="80"/>
+              <w:right w:type="dxa" w:w="120"/>
+            </w:tcMar>
+          </w:tcPr>
+          <w:p>
+            <w:r>
+              <w:rPr>
+                <w:rFonts w:ascii="Arial" w:cs="Arial" w:eastAsia="Arial" w:hAnsi="Arial"/>
+                <w:b/>
+                <w:bCs/>
+                <w:color w:val="FFFFFF"/>
+                <w:sz w:val="20"/>
+                <w:szCs w:val="20"/>
+              </w:rPr>
+              <w:t xml:space="preserve">Task</w:t>
+            </w:r>
+          </w:p>
+        </w:tc>
+        <w:tc>
+          <w:tcPr>
+            <w:tcW w:type="dxa" w:w="4680"/>
+            <w:tcBorders>
+              <w:top w:val="single" w:color="CCCCCC" w:sz="1"/>
+              <w:left w:val="single" w:color="CCCCCC" w:sz="1"/>
+              <w:bottom w:val="single" w:color="CCCCCC" w:sz="1"/>
+              <w:right w:val="single" w:color="CCCCCC" w:sz="1"/>
+            </w:tcBorders>
+            <w:shd w:fill="2E4057" w:val="clear"/>
+            <w:tcMar>
+              <w:top w:type="dxa" w:w="80"/>
+              <w:left w:type="dxa" w:w="120"/>
+              <w:bottom w:type="dxa" w:w="80"/>
+              <w:right w:type="dxa" w:w="120"/>
+            </w:tcMar>
+          </w:tcPr>
+          <w:p>
+            <w:r>
+              <w:rPr>
+                <w:rFonts w:ascii="Arial" w:cs="Arial" w:eastAsia="Arial" w:hAnsi="Arial"/>
+                <w:b/>
+                <w:bCs/>
+                <w:color w:val="FFFFFF"/>
+                <w:sz w:val="20"/>
+                <w:szCs w:val="20"/>
+              </w:rPr>
+              <w:t xml:space="preserve">How</w:t>
+            </w:r>
+          </w:p>
+        </w:tc>
+      </w:tr>
+      <w:tr>
+        <w:tc>
+          <w:tcPr>
+            <w:tcW w:type="dxa" w:w="4680"/>
+            <w:tcBorders>
+              <w:top w:val="single" w:color="CCCCCC" w:sz="1"/>
+              <w:left w:val="single" w:color="CCCCCC" w:sz="1"/>
+              <w:bottom w:val="single" w:color="CCCCCC" w:sz="1"/>
+              <w:right w:val="single" w:color="CCCCCC" w:sz="1"/>
+            </w:tcBorders>
+            <w:shd w:fill="F5F5F5" w:val="clear"/>
+            <w:tcMar>
+              <w:top w:type="dxa" w:w="80"/>
+              <w:left w:type="dxa" w:w="120"/>
+              <w:bottom w:type="dxa" w:w="80"/>
+              <w:right w:type="dxa" w:w="120"/>
+            </w:tcMar>
+          </w:tcPr>
+          <w:p>
+            <w:r>
+              <w:rPr>
+                <w:rFonts w:ascii="Arial" w:cs="Arial" w:eastAsia="Arial" w:hAnsi="Arial"/>
+                <w:b w:val="false"/>
+                <w:bCs w:val="false"/>
+                <w:color w:val="333333"/>
+                <w:sz w:val="20"/>
+                <w:szCs w:val="20"/>
+              </w:rPr>
+              <w:t xml:space="preserve">Change speed</w:t>
+            </w:r>
+          </w:p>
+        </w:tc>
+        <w:tc>
+          <w:tcPr>
+            <w:tcW w:type="dxa" w:w="4680"/>
+            <w:tcBorders>
+              <w:top w:val="single" w:color="CCCCCC" w:sz="1"/>
+              <w:left w:val="single" w:color="CCCCCC" w:sz="1"/>
+              <w:bottom w:val="single" w:color="CCCCCC" w:sz="1"/>
+              <w:right w:val="single" w:color="CCCCCC" w:sz="1"/>
+            </w:tcBorders>
+            <w:shd w:fill="F5F5F5" w:val="clear"/>
+            <w:tcMar>
+              <w:top w:type="dxa" w:w="80"/>
+              <w:left w:type="dxa" w:w="120"/>
+              <w:bottom w:type="dxa" w:w="80"/>
+              <w:right w:type="dxa" w:w="120"/>
+            </w:tcMar>
+          </w:tcPr>
+          <w:p>
+            <w:r>
+              <w:rPr>
+                <w:rFonts w:ascii="Arial" w:cs="Arial" w:eastAsia="Arial" w:hAnsi="Arial"/>
+                <w:b w:val="false"/>
+                <w:bCs w:val="false"/>
+                <w:color w:val="333333"/>
+                <w:sz w:val="20"/>
+                <w:szCs w:val="20"/>
+              </w:rPr>
+              <w:t xml:space="preserve">Short press → WPM → long press → turn → short press</w:t>
+            </w:r>
+          </w:p>
+        </w:tc>
+      </w:tr>
+      <w:tr>
+        <w:tc>
+          <w:tcPr>
+            <w:tcW w:type="dxa" w:w="4680"/>
+            <w:tcBorders>
+              <w:top w:val="single" w:color="CCCCCC" w:sz="1"/>
+              <w:left w:val="single" w:color="CCCCCC" w:sz="1"/>
+              <w:bottom w:val="single" w:color="CCCCCC" w:sz="1"/>
+              <w:right w:val="single" w:color="CCCCCC" w:sz="1"/>
+            </w:tcBorders>
+            <w:shd w:fill="F5F5F5" w:val="clear"/>
+            <w:tcMar>
+              <w:top w:type="dxa" w:w="80"/>
+              <w:left w:type="dxa" w:w="120"/>
+              <w:bottom w:type="dxa" w:w="80"/>
+              <w:right w:type="dxa" w:w="120"/>
+            </w:tcMar>
+          </w:tcPr>
+          <w:p>
+            <w:r>
+              <w:rPr>
+                <w:rFonts w:ascii="Arial" w:cs="Arial" w:eastAsia="Arial" w:hAnsi="Arial"/>
+                <w:b w:val="false"/>
+                <w:bCs w:val="false"/>
+                <w:color w:val="333333"/>
+                <w:sz w:val="20"/>
+                <w:szCs w:val="20"/>
+              </w:rPr>
+              <w:t xml:space="preserve">Set Farnsworth</w:t>
+            </w:r>
+          </w:p>
+        </w:tc>
+        <w:tc>
+          <w:tcPr>
+            <w:tcW w:type="dxa" w:w="4680"/>
+            <w:tcBorders>
+              <w:top w:val="single" w:color="CCCCCC" w:sz="1"/>
+              <w:left w:val="single" w:color="CCCCCC" w:sz="1"/>
+              <w:bottom w:val="single" w:color="CCCCCC" w:sz="1"/>
+              <w:right w:val="single" w:color="CCCCCC" w:sz="1"/>
+            </w:tcBorders>
+            <w:shd w:fill="F5F5F5" w:val="clear"/>
+            <w:tcMar>
+              <w:top w:type="dxa" w:w="80"/>
+              <w:left w:type="dxa" w:w="120"/>
+              <w:bottom w:type="dxa" w:w="80"/>
+              <w:right w:type="dxa" w:w="120"/>
+            </w:tcMar>
+          </w:tcPr>
+          <w:p>
+            <w:r>
+              <w:rPr>
+                <w:rFonts w:ascii="Arial" w:cs="Arial" w:eastAsia="Arial" w:hAnsi="Arial"/>
+                <w:b w:val="false"/>
+                <w:bCs w:val="false"/>
+                <w:color w:val="333333"/>
+                <w:sz w:val="20"/>
+                <w:szCs w:val="20"/>
+              </w:rPr>
+              <w:t xml:space="preserve">Long press WPM → char speed → short press → gap speed → short press</w:t>
+            </w:r>
+          </w:p>
+        </w:tc>
+      </w:tr>
+      <w:tr>
+        <w:tc>
+          <w:tcPr>
+            <w:tcW w:type="dxa" w:w="4680"/>
+            <w:tcBorders>
+              <w:top w:val="single" w:color="CCCCCC" w:sz="1"/>
+              <w:left w:val="single" w:color="CCCCCC" w:sz="1"/>
+              <w:bottom w:val="single" w:color="CCCCCC" w:sz="1"/>
+              <w:right w:val="single" w:color="CCCCCC" w:sz="1"/>
+            </w:tcBorders>
+            <w:shd w:fill="F5F5F5" w:val="clear"/>
+            <w:tcMar>
+              <w:top w:type="dxa" w:w="80"/>
+              <w:left w:type="dxa" w:w="120"/>
+              <w:bottom w:type="dxa" w:w="80"/>
+              <w:right w:type="dxa" w:w="120"/>
+            </w:tcMar>
+          </w:tcPr>
+          <w:p>
+            <w:r>
+              <w:rPr>
+                <w:rFonts w:ascii="Arial" w:cs="Arial" w:eastAsia="Arial" w:hAnsi="Arial"/>
+                <w:b w:val="false"/>
+                <w:bCs w:val="false"/>
+                <w:color w:val="333333"/>
+                <w:sz w:val="20"/>
+                <w:szCs w:val="20"/>
+              </w:rPr>
+              <w:t xml:space="preserve">Swap dit/dah</w:t>
+            </w:r>
+          </w:p>
+        </w:tc>
+        <w:tc>
+          <w:tcPr>
+            <w:tcW w:type="dxa" w:w="4680"/>
+            <w:tcBorders>
+              <w:top w:val="single" w:color="CCCCCC" w:sz="1"/>
+              <w:left w:val="single" w:color="CCCCCC" w:sz="1"/>
+              <w:bottom w:val="single" w:color="CCCCCC" w:sz="1"/>
+              <w:right w:val="single" w:color="CCCCCC" w:sz="1"/>
+            </w:tcBorders>
+            <w:shd w:fill="F5F5F5" w:val="clear"/>
+            <w:tcMar>
+              <w:top w:type="dxa" w:w="80"/>
+              <w:left w:type="dxa" w:w="120"/>
+              <w:bottom w:type="dxa" w:w="80"/>
+              <w:right w:type="dxa" w:w="120"/>
+            </w:tcMar>
+          </w:tcPr>
+          <w:p>
+            <w:r>
+              <w:rPr>
+                <w:rFonts w:ascii="Arial" w:cs="Arial" w:eastAsia="Arial" w:hAnsi="Arial"/>
+                <w:b w:val="false"/>
+                <w:bCs w:val="false"/>
+                <w:color w:val="333333"/>
+                <w:sz w:val="20"/>
+                <w:szCs w:val="20"/>
+              </w:rPr>
+              <w:t xml:space="preserve">Short press paddle reverse button OR web page</w:t>
+            </w:r>
+          </w:p>
+        </w:tc>
+      </w:tr>
+      <w:tr>
+        <w:tc>
+          <w:tcPr>
+            <w:tcW w:type="dxa" w:w="4680"/>
+            <w:tcBorders>
+              <w:top w:val="single" w:color="CCCCCC" w:sz="1"/>
+              <w:left w:val="single" w:color="CCCCCC" w:sz="1"/>
+              <w:bottom w:val="single" w:color="CCCCCC" w:sz="1"/>
+              <w:right w:val="single" w:color="CCCCCC" w:sz="1"/>
+            </w:tcBorders>
+            <w:shd w:fill="F5F5F5" w:val="clear"/>
+            <w:tcMar>
+              <w:top w:type="dxa" w:w="80"/>
+              <w:left w:type="dxa" w:w="120"/>
+              <w:bottom w:type="dxa" w:w="80"/>
+              <w:right w:type="dxa" w:w="120"/>
+            </w:tcMar>
+          </w:tcPr>
+          <w:p>
+            <w:r>
+              <w:rPr>
+                <w:rFonts w:ascii="Arial" w:cs="Arial" w:eastAsia="Arial" w:hAnsi="Arial"/>
+                <w:b w:val="false"/>
+                <w:bCs w:val="false"/>
+                <w:color w:val="333333"/>
+                <w:sz w:val="20"/>
+                <w:szCs w:val="20"/>
+              </w:rPr>
+              <w:t xml:space="preserve">Toggle Mode A/B</w:t>
+            </w:r>
+          </w:p>
+        </w:tc>
+        <w:tc>
+          <w:tcPr>
+            <w:tcW w:type="dxa" w:w="4680"/>
+            <w:tcBorders>
+              <w:top w:val="single" w:color="CCCCCC" w:sz="1"/>
+              <w:left w:val="single" w:color="CCCCCC" w:sz="1"/>
+              <w:bottom w:val="single" w:color="CCCCCC" w:sz="1"/>
+              <w:right w:val="single" w:color="CCCCCC" w:sz="1"/>
+            </w:tcBorders>
+            <w:shd w:fill="F5F5F5" w:val="clear"/>
+            <w:tcMar>
+              <w:top w:type="dxa" w:w="80"/>
+              <w:left w:type="dxa" w:w="120"/>
+              <w:bottom w:type="dxa" w:w="80"/>
+              <w:right w:type="dxa" w:w="120"/>
+            </w:tcMar>
+          </w:tcPr>
+          <w:p>
+            <w:r>
+              <w:rPr>
+                <w:rFonts w:ascii="Arial" w:cs="Arial" w:eastAsia="Arial" w:hAnsi="Arial"/>
+                <w:b w:val="false"/>
+                <w:bCs w:val="false"/>
+                <w:color w:val="333333"/>
+                <w:sz w:val="20"/>
+                <w:szCs w:val="20"/>
+              </w:rPr>
+              <w:t xml:space="preserve">Long press paddle reverse button</w:t>
+            </w:r>
+          </w:p>
+        </w:tc>
+      </w:tr>
+      <w:tr>
+        <w:tc>
+          <w:tcPr>
+            <w:tcW w:type="dxa" w:w="4680"/>
+            <w:tcBorders>
+              <w:top w:val="single" w:color="CCCCCC" w:sz="1"/>
+              <w:left w:val="single" w:color="CCCCCC" w:sz="1"/>
+              <w:bottom w:val="single" w:color="CCCCCC" w:sz="1"/>
+              <w:right w:val="single" w:color="CCCCCC" w:sz="1"/>
+            </w:tcBorders>
+            <w:shd w:fill="F5F5F5" w:val="clear"/>
+            <w:tcMar>
+              <w:top w:type="dxa" w:w="80"/>
+              <w:left w:type="dxa" w:w="120"/>
+              <w:bottom w:type="dxa" w:w="80"/>
+              <w:right w:type="dxa" w:w="120"/>
+            </w:tcMar>
+          </w:tcPr>
+          <w:p>
+            <w:r>
+              <w:rPr>
+                <w:rFonts w:ascii="Arial" w:cs="Arial" w:eastAsia="Arial" w:hAnsi="Arial"/>
+                <w:b w:val="false"/>
+                <w:bCs w:val="false"/>
+                <w:color w:val="333333"/>
+                <w:sz w:val="20"/>
+                <w:szCs w:val="20"/>
+              </w:rPr>
+              <w:t xml:space="preserve">Connect phone</w:t>
+            </w:r>
+          </w:p>
+        </w:tc>
+        <w:tc>
+          <w:tcPr>
+            <w:tcW w:type="dxa" w:w="4680"/>
+            <w:tcBorders>
+              <w:top w:val="single" w:color="CCCCCC" w:sz="1"/>
+              <w:left w:val="single" w:color="CCCCCC" w:sz="1"/>
+              <w:bottom w:val="single" w:color="CCCCCC" w:sz="1"/>
+              <w:right w:val="single" w:color="CCCCCC" w:sz="1"/>
+            </w:tcBorders>
+            <w:shd w:fill="F5F5F5" w:val="clear"/>
+            <w:tcMar>
+              <w:top w:type="dxa" w:w="80"/>
+              <w:left w:type="dxa" w:w="120"/>
+              <w:bottom w:type="dxa" w:w="80"/>
+              <w:right w:type="dxa" w:w="120"/>
+            </w:tcMar>
+          </w:tcPr>
+          <w:p>
+            <w:r>
+              <w:rPr>
+                <w:rFonts w:ascii="Arial" w:cs="Arial" w:eastAsia="Arial" w:hAnsi="Arial"/>
+                <w:b w:val="false"/>
+                <w:bCs w:val="false"/>
+                <w:color w:val="333333"/>
+                <w:sz w:val="20"/>
+                <w:szCs w:val="20"/>
+              </w:rPr>
+              <w:t xml:space="preserve">WiFi → K0WLY-XXXX → browser → 192.168.4.1</w:t>
+            </w:r>
+          </w:p>
+        </w:tc>
+      </w:tr>
+      <w:tr>
+        <w:tc>
+          <w:tcPr>
+            <w:tcW w:type="dxa" w:w="4680"/>
+            <w:tcBorders>
+              <w:top w:val="single" w:color="CCCCCC" w:sz="1"/>
+              <w:left w:val="single" w:color="CCCCCC" w:sz="1"/>
+              <w:bottom w:val="single" w:color="CCCCCC" w:sz="1"/>
+              <w:right w:val="single" w:color="CCCCCC" w:sz="1"/>
+            </w:tcBorders>
+            <w:shd w:fill="F5F5F5" w:val="clear"/>
+            <w:tcMar>
+              <w:top w:type="dxa" w:w="80"/>
+              <w:left w:type="dxa" w:w="120"/>
+              <w:bottom w:type="dxa" w:w="80"/>
+              <w:right w:type="dxa" w:w="120"/>
+            </w:tcMar>
+          </w:tcPr>
+          <w:p>
+            <w:r>
+              <w:rPr>
+                <w:rFonts w:ascii="Arial" w:cs="Arial" w:eastAsia="Arial" w:hAnsi="Arial"/>
+                <w:b w:val="false"/>
+                <w:bCs w:val="false"/>
+                <w:color w:val="333333"/>
+                <w:sz w:val="20"/>
+                <w:szCs w:val="20"/>
+              </w:rPr>
+              <w:t xml:space="preserve">Play a file</w:t>
+            </w:r>
+          </w:p>
+        </w:tc>
+        <w:tc>
+          <w:tcPr>
+            <w:tcW w:type="dxa" w:w="4680"/>
+            <w:tcBorders>
+              <w:top w:val="single" w:color="CCCCCC" w:sz="1"/>
+              <w:left w:val="single" w:color="CCCCCC" w:sz="1"/>
+              <w:bottom w:val="single" w:color="CCCCCC" w:sz="1"/>
+              <w:right w:val="single" w:color="CCCCCC" w:sz="1"/>
+            </w:tcBorders>
+            <w:shd w:fill="F5F5F5" w:val="clear"/>
+            <w:tcMar>
+              <w:top w:type="dxa" w:w="80"/>
+              <w:left w:type="dxa" w:w="120"/>
+              <w:bottom w:type="dxa" w:w="80"/>
+              <w:right w:type="dxa" w:w="120"/>
+            </w:tcMar>
+          </w:tcPr>
+          <w:p>
+            <w:r>
+              <w:rPr>
+                <w:rFonts w:ascii="Arial" w:cs="Arial" w:eastAsia="Arial" w:hAnsi="Arial"/>
+                <w:b w:val="false"/>
+                <w:bCs w:val="false"/>
+                <w:color w:val="333333"/>
+                <w:sz w:val="20"/>
+                <w:szCs w:val="20"/>
+              </w:rPr>
+              <w:t xml:space="preserve">Web page → ▶ next to file name</w:t>
+            </w:r>
+          </w:p>
+        </w:tc>
+      </w:tr>
+      <w:tr>
+        <w:tc>
+          <w:tcPr>
+            <w:tcW w:type="dxa" w:w="4680"/>
+            <w:tcBorders>
+              <w:top w:val="single" w:color="CCCCCC" w:sz="1"/>
+              <w:left w:val="single" w:color="CCCCCC" w:sz="1"/>
+              <w:bottom w:val="single" w:color="CCCCCC" w:sz="1"/>
+              <w:right w:val="single" w:color="CCCCCC" w:sz="1"/>
+            </w:tcBorders>
+            <w:shd w:fill="F5F5F5" w:val="clear"/>
+            <w:tcMar>
+              <w:top w:type="dxa" w:w="80"/>
+              <w:left w:type="dxa" w:w="120"/>
+              <w:bottom w:type="dxa" w:w="80"/>
+              <w:right w:type="dxa" w:w="120"/>
+            </w:tcMar>
+          </w:tcPr>
+          <w:p>
+            <w:r>
+              <w:rPr>
+                <w:rFonts w:ascii="Arial" w:cs="Arial" w:eastAsia="Arial" w:hAnsi="Arial"/>
+                <w:b w:val="false"/>
+                <w:bCs w:val="false"/>
+                <w:color w:val="333333"/>
+                <w:sz w:val="20"/>
+                <w:szCs w:val="20"/>
+              </w:rPr>
+              <w:t xml:space="preserve">Pause playback</w:t>
+            </w:r>
+          </w:p>
+        </w:tc>
+        <w:tc>
+          <w:tcPr>
+            <w:tcW w:type="dxa" w:w="4680"/>
+            <w:tcBorders>
+              <w:top w:val="single" w:color="CCCCCC" w:sz="1"/>
+              <w:left w:val="single" w:color="CCCCCC" w:sz="1"/>
+              <w:bottom w:val="single" w:color="CCCCCC" w:sz="1"/>
+              <w:right w:val="single" w:color="CCCCCC" w:sz="1"/>
+            </w:tcBorders>
+            <w:shd w:fill="F5F5F5" w:val="clear"/>
+            <w:tcMar>
+              <w:top w:type="dxa" w:w="80"/>
+              <w:left w:type="dxa" w:w="120"/>
+              <w:bottom w:type="dxa" w:w="80"/>
+              <w:right w:type="dxa" w:w="120"/>
+            </w:tcMar>
+          </w:tcPr>
+          <w:p>
+            <w:r>
+              <w:rPr>
+                <w:rFonts w:ascii="Arial" w:cs="Arial" w:eastAsia="Arial" w:hAnsi="Arial"/>
+                <w:b w:val="false"/>
+                <w:bCs w:val="false"/>
+                <w:color w:val="333333"/>
+                <w:sz w:val="20"/>
+                <w:szCs w:val="20"/>
+              </w:rPr>
+              <w:t xml:space="preserve">Web page → Pause/Resume</w:t>
+            </w:r>
+          </w:p>
+        </w:tc>
+      </w:tr>
+      <w:tr>
+        <w:tc>
+          <w:tcPr>
+            <w:tcW w:type="dxa" w:w="4680"/>
+            <w:tcBorders>
+              <w:top w:val="single" w:color="CCCCCC" w:sz="1"/>
+              <w:left w:val="single" w:color="CCCCCC" w:sz="1"/>
+              <w:bottom w:val="single" w:color="CCCCCC" w:sz="1"/>
+              <w:right w:val="single" w:color="CCCCCC" w:sz="1"/>
+            </w:tcBorders>
+            <w:shd w:fill="F5F5F5" w:val="clear"/>
+            <w:tcMar>
+              <w:top w:type="dxa" w:w="80"/>
+              <w:left w:type="dxa" w:w="120"/>
+              <w:bottom w:type="dxa" w:w="80"/>
+              <w:right w:type="dxa" w:w="120"/>
+            </w:tcMar>
+          </w:tcPr>
+          <w:p>
+            <w:r>
+              <w:rPr>
+                <w:rFonts w:ascii="Arial" w:cs="Arial" w:eastAsia="Arial" w:hAnsi="Arial"/>
+                <w:b w:val="false"/>
+                <w:bCs w:val="false"/>
+                <w:color w:val="333333"/>
+                <w:sz w:val="20"/>
+                <w:szCs w:val="20"/>
+              </w:rPr>
+              <w:t xml:space="preserve">Stop playback</w:t>
+            </w:r>
+          </w:p>
+        </w:tc>
+        <w:tc>
+          <w:tcPr>
+            <w:tcW w:type="dxa" w:w="4680"/>
+            <w:tcBorders>
+              <w:top w:val="single" w:color="CCCCCC" w:sz="1"/>
+              <w:left w:val="single" w:color="CCCCCC" w:sz="1"/>
+              <w:bottom w:val="single" w:color="CCCCCC" w:sz="1"/>
+              <w:right w:val="single" w:color="CCCCCC" w:sz="1"/>
+            </w:tcBorders>
+            <w:shd w:fill="F5F5F5" w:val="clear"/>
+            <w:tcMar>
+              <w:top w:type="dxa" w:w="80"/>
+              <w:left w:type="dxa" w:w="120"/>
+              <w:bottom w:type="dxa" w:w="80"/>
+              <w:right w:type="dxa" w:w="120"/>
+            </w:tcMar>
+          </w:tcPr>
+          <w:p>
+            <w:r>
+              <w:rPr>
+                <w:rFonts w:ascii="Arial" w:cs="Arial" w:eastAsia="Arial" w:hAnsi="Arial"/>
+                <w:b w:val="false"/>
+                <w:bCs w:val="false"/>
+                <w:color w:val="333333"/>
+                <w:sz w:val="20"/>
+                <w:szCs w:val="20"/>
+              </w:rPr>
+              <w:t xml:space="preserve">Web page → Stop Playback</w:t>
+            </w:r>
+          </w:p>
+        </w:tc>
+      </w:tr>
+      <w:tr>
+        <w:tc>
+          <w:tcPr>
+            <w:tcW w:type="dxa" w:w="4680"/>
+            <w:tcBorders>
+              <w:top w:val="single" w:color="CCCCCC" w:sz="1"/>
+              <w:left w:val="single" w:color="CCCCCC" w:sz="1"/>
+              <w:bottom w:val="single" w:color="CCCCCC" w:sz="1"/>
+              <w:right w:val="single" w:color="CCCCCC" w:sz="1"/>
+            </w:tcBorders>
+            <w:shd w:fill="F5F5F5" w:val="clear"/>
+            <w:tcMar>
+              <w:top w:type="dxa" w:w="80"/>
+              <w:left w:type="dxa" w:w="120"/>
+              <w:bottom w:type="dxa" w:w="80"/>
+              <w:right w:type="dxa" w:w="120"/>
+            </w:tcMar>
+          </w:tcPr>
+          <w:p>
+            <w:r>
+              <w:rPr>
+                <w:rFonts w:ascii="Arial" w:cs="Arial" w:eastAsia="Arial" w:hAnsi="Arial"/>
+                <w:b w:val="false"/>
+                <w:bCs w:val="false"/>
+                <w:color w:val="333333"/>
+                <w:sz w:val="20"/>
+                <w:szCs w:val="20"/>
+              </w:rPr>
+              <w:t xml:space="preserve">Audio Only mode</w:t>
+            </w:r>
+          </w:p>
+        </w:tc>
+        <w:tc>
+          <w:tcPr>
+            <w:tcW w:type="dxa" w:w="4680"/>
+            <w:tcBorders>
+              <w:top w:val="single" w:color="CCCCCC" w:sz="1"/>
+              <w:left w:val="single" w:color="CCCCCC" w:sz="1"/>
+              <w:bottom w:val="single" w:color="CCCCCC" w:sz="1"/>
+              <w:right w:val="single" w:color="CCCCCC" w:sz="1"/>
+            </w:tcBorders>
+            <w:shd w:fill="F5F5F5" w:val="clear"/>
+            <w:tcMar>
+              <w:top w:type="dxa" w:w="80"/>
+              <w:left w:type="dxa" w:w="120"/>
+              <w:bottom w:type="dxa" w:w="80"/>
+              <w:right w:type="dxa" w:w="120"/>
+            </w:tcMar>
+          </w:tcPr>
+          <w:p>
+            <w:r>
+              <w:rPr>
+                <w:rFonts w:ascii="Arial" w:cs="Arial" w:eastAsia="Arial" w:hAnsi="Arial"/>
+                <w:b w:val="false"/>
+                <w:bCs w:val="false"/>
+                <w:color w:val="333333"/>
+                <w:sz w:val="20"/>
+                <w:szCs w:val="20"/>
+              </w:rPr>
+              <w:t xml:space="preserve">Short press → DELAY → long press → turn to max → short press</w:t>
+            </w:r>
+          </w:p>
+        </w:tc>
+      </w:tr>
+    </w:tbl>
+    <w:p>
+      <w:pPr>
+        <w:spacing w:after="120"/>
+      </w:pPr>
+      <w:r>
+        <w:t xml:space="preserve"/>
+      </w:r>
+    </w:p>
+    <w:p>
+      <w:pPr>
+        <w:pStyle w:val="Heading1"/>
+      </w:pPr>
+      <w:r>
+        <w:rPr>
+          <w:rFonts w:ascii="Arial" w:cs="Arial" w:eastAsia="Arial" w:hAnsi="Arial"/>
+          <w:b/>
+          <w:bCs/>
+          <w:color w:val="2E4057"/>
+          <w:sz w:val="32"/>
+          <w:szCs w:val="32"/>
+        </w:rPr>
+        <w:t xml:space="preserve">Morse Code Reference</w:t>
       </w:r>
     </w:p>
     <w:p>
@@ -6156,7 +5802,7 @@
           <w:sz w:val="22"/>
           <w:szCs w:val="22"/>
         </w:rPr>
-        <w:t xml:space="preserve">Prosigns (sent as single characters in text files):</w:t>
+        <w:t xml:space="preserve">Prosigns:</w:t>
       </w:r>
     </w:p>
     <w:tbl>
@@ -6360,986 +6006,7 @@
     </w:p>
     <w:p>
       <w:pPr>
-        <w:pStyle w:val="Heading1"/>
-      </w:pPr>
-      <w:r>
-        <w:rPr>
-          <w:rFonts w:ascii="Arial" w:cs="Arial" w:eastAsia="Arial" w:hAnsi="Arial"/>
-          <w:b/>
-          <w:bCs/>
-          <w:color w:val="2E4057"/>
-          <w:sz w:val="32"/>
-          <w:szCs w:val="32"/>
-        </w:rPr>
-        <w:t xml:space="preserve">10. Practice Tips</w:t>
-      </w:r>
-    </w:p>
-    <w:p>
-      <w:pPr>
-        <w:pStyle w:val="ListParagraph"/>
-        <w:numPr>
-          <w:ilvl w:val="0"/>
-          <w:numId w:val="2"/>
-        </w:numPr>
-        <w:spacing w:after="80"/>
-      </w:pPr>
-      <w:r>
-        <w:rPr>
-          <w:rFonts w:ascii="Arial" w:cs="Arial" w:eastAsia="Arial" w:hAnsi="Arial"/>
-          <w:sz w:val="22"/>
-          <w:szCs w:val="22"/>
-        </w:rPr>
-        <w:t xml:space="preserve">Start at a comfortable speed — it’s better to copy correctly slowly than struggle fast</w:t>
-      </w:r>
-    </w:p>
-    <w:p>
-      <w:pPr>
-        <w:pStyle w:val="ListParagraph"/>
-        <w:numPr>
-          <w:ilvl w:val="0"/>
-          <w:numId w:val="2"/>
-        </w:numPr>
-        <w:spacing w:after="80"/>
-      </w:pPr>
-      <w:r>
-        <w:rPr>
-          <w:rFonts w:ascii="Arial" w:cs="Arial" w:eastAsia="Arial" w:hAnsi="Arial"/>
-          <w:sz w:val="22"/>
-          <w:szCs w:val="22"/>
-        </w:rPr>
-        <w:t xml:space="preserve">Use Farnsworth spacing — set char speed to 20-25 WPM but effective speed to 5-10 WPM. Your ear learns real-speed characters while you have time to process them</w:t>
-      </w:r>
-    </w:p>
-    <w:p>
-      <w:pPr>
-        <w:pStyle w:val="ListParagraph"/>
-        <w:numPr>
-          <w:ilvl w:val="0"/>
-          <w:numId w:val="2"/>
-        </w:numPr>
-        <w:spacing w:after="80"/>
-      </w:pPr>
-      <w:r>
-        <w:rPr>
-          <w:rFonts w:ascii="Arial" w:cs="Arial" w:eastAsia="Arial" w:hAnsi="Arial"/>
-          <w:sz w:val="22"/>
-          <w:szCs w:val="22"/>
-        </w:rPr>
-        <w:t xml:space="preserve">Use head copy delay — start at 0.5s and gradually increase. Work toward Audio Only mode</w:t>
-      </w:r>
-    </w:p>
-    <w:p>
-      <w:pPr>
-        <w:pStyle w:val="ListParagraph"/>
-        <w:numPr>
-          <w:ilvl w:val="0"/>
-          <w:numId w:val="2"/>
-        </w:numPr>
-        <w:spacing w:after="80"/>
-      </w:pPr>
-      <w:r>
-        <w:rPr>
-          <w:rFonts w:ascii="Arial" w:cs="Arial" w:eastAsia="Arial" w:hAnsi="Arial"/>
-          <w:sz w:val="22"/>
-          <w:szCs w:val="22"/>
-        </w:rPr>
-        <w:t xml:space="preserve">Practice with real QSO text, call signs, and contest exchanges — not just random letters</w:t>
-      </w:r>
-    </w:p>
-    <w:p>
-      <w:pPr>
-        <w:pStyle w:val="ListParagraph"/>
-        <w:numPr>
-          <w:ilvl w:val="0"/>
-          <w:numId w:val="2"/>
-        </w:numPr>
-        <w:spacing w:after="80"/>
-      </w:pPr>
-      <w:r>
-        <w:rPr>
-          <w:rFonts w:ascii="Arial" w:cs="Arial" w:eastAsia="Arial" w:hAnsi="Arial"/>
-          <w:sz w:val="22"/>
-          <w:szCs w:val="22"/>
-        </w:rPr>
-        <w:t xml:space="preserve">The word gap setting (GAP:6 or 7) makes copied text much more readable on screen</w:t>
-      </w:r>
-    </w:p>
-    <w:p>
-      <w:pPr>
-        <w:pStyle w:val="ListParagraph"/>
-        <w:numPr>
-          <w:ilvl w:val="0"/>
-          <w:numId w:val="2"/>
-        </w:numPr>
-        <w:spacing w:after="80"/>
-      </w:pPr>
-      <w:r>
-        <w:rPr>
-          <w:rFonts w:ascii="Arial" w:cs="Arial" w:eastAsia="Arial" w:hAnsi="Arial"/>
-          <w:sz w:val="22"/>
-          <w:szCs w:val="22"/>
-        </w:rPr>
-        <w:t xml:space="preserve">Two-unit practice is the closest thing to a real QSO — use it as much as possible</w:t>
-      </w:r>
-    </w:p>
-    <w:p>
-      <w:pPr>
-        <w:pStyle w:val="ListParagraph"/>
-        <w:numPr>
-          <w:ilvl w:val="0"/>
-          <w:numId w:val="2"/>
-        </w:numPr>
-        <w:spacing w:after="80"/>
-      </w:pPr>
-      <w:r>
-        <w:rPr>
-          <w:rFonts w:ascii="Arial" w:cs="Arial" w:eastAsia="Arial" w:hAnsi="Arial"/>
-          <w:sz w:val="22"/>
-          <w:szCs w:val="22"/>
-        </w:rPr>
-        <w:t xml:space="preserve">Listen to the playback files repeatedly until the characters sound like whole words, not individual dits and dahs</w:t>
-      </w:r>
-    </w:p>
-    <w:p>
-      <w:pPr>
-        <w:spacing w:after="120"/>
-      </w:pPr>
-      <w:r>
-        <w:t xml:space="preserve"/>
-      </w:r>
-    </w:p>
-    <w:p>
-      <w:pPr>
-        <w:pStyle w:val="Heading1"/>
-      </w:pPr>
-      <w:r>
-        <w:rPr>
-          <w:rFonts w:ascii="Arial" w:cs="Arial" w:eastAsia="Arial" w:hAnsi="Arial"/>
-          <w:b/>
-          <w:bCs/>
-          <w:color w:val="2E4057"/>
-          <w:sz w:val="32"/>
-          <w:szCs w:val="32"/>
-        </w:rPr>
-        <w:t xml:space="preserve">11. Quick Reference Card</w:t>
-      </w:r>
-    </w:p>
-    <w:tbl>
-      <w:tblPr>
-        <w:tblW w:type="dxa" w:w="9360"/>
-        <w:tblBorders>
-          <w:top w:val="single" w:color="auto" w:sz="4"/>
-          <w:left w:val="single" w:color="auto" w:sz="4"/>
-          <w:bottom w:val="single" w:color="auto" w:sz="4"/>
-          <w:right w:val="single" w:color="auto" w:sz="4"/>
-          <w:insideH w:val="single" w:color="auto" w:sz="4"/>
-          <w:insideV w:val="single" w:color="auto" w:sz="4"/>
-        </w:tblBorders>
-      </w:tblPr>
-      <w:tblGrid>
-        <w:gridCol w:w="4680"/>
-        <w:gridCol w:w="4680"/>
-      </w:tblGrid>
-      <w:tr>
-        <w:tc>
-          <w:tcPr>
-            <w:tcW w:type="dxa" w:w="4680"/>
-            <w:tcBorders>
-              <w:top w:val="single" w:color="CCCCCC" w:sz="1"/>
-              <w:left w:val="single" w:color="CCCCCC" w:sz="1"/>
-              <w:bottom w:val="single" w:color="CCCCCC" w:sz="1"/>
-              <w:right w:val="single" w:color="CCCCCC" w:sz="1"/>
-            </w:tcBorders>
-            <w:shd w:fill="2E4057" w:val="clear"/>
-            <w:tcMar>
-              <w:top w:type="dxa" w:w="80"/>
-              <w:left w:type="dxa" w:w="120"/>
-              <w:bottom w:type="dxa" w:w="80"/>
-              <w:right w:type="dxa" w:w="120"/>
-            </w:tcMar>
-          </w:tcPr>
-          <w:p>
-            <w:r>
-              <w:rPr>
-                <w:rFonts w:ascii="Arial" w:cs="Arial" w:eastAsia="Arial" w:hAnsi="Arial"/>
-                <w:b/>
-                <w:bCs/>
-                <w:color w:val="FFFFFF"/>
-                <w:sz w:val="20"/>
-                <w:szCs w:val="20"/>
-              </w:rPr>
-              <w:t xml:space="preserve">Task</w:t>
-            </w:r>
-          </w:p>
-        </w:tc>
-        <w:tc>
-          <w:tcPr>
-            <w:tcW w:type="dxa" w:w="4680"/>
-            <w:tcBorders>
-              <w:top w:val="single" w:color="CCCCCC" w:sz="1"/>
-              <w:left w:val="single" w:color="CCCCCC" w:sz="1"/>
-              <w:bottom w:val="single" w:color="CCCCCC" w:sz="1"/>
-              <w:right w:val="single" w:color="CCCCCC" w:sz="1"/>
-            </w:tcBorders>
-            <w:shd w:fill="2E4057" w:val="clear"/>
-            <w:tcMar>
-              <w:top w:type="dxa" w:w="80"/>
-              <w:left w:type="dxa" w:w="120"/>
-              <w:bottom w:type="dxa" w:w="80"/>
-              <w:right w:type="dxa" w:w="120"/>
-            </w:tcMar>
-          </w:tcPr>
-          <w:p>
-            <w:r>
-              <w:rPr>
-                <w:rFonts w:ascii="Arial" w:cs="Arial" w:eastAsia="Arial" w:hAnsi="Arial"/>
-                <w:b/>
-                <w:bCs/>
-                <w:color w:val="FFFFFF"/>
-                <w:sz w:val="20"/>
-                <w:szCs w:val="20"/>
-              </w:rPr>
-              <w:t xml:space="preserve">How to Do It</w:t>
-            </w:r>
-          </w:p>
-        </w:tc>
-      </w:tr>
-      <w:tr>
-        <w:tc>
-          <w:tcPr>
-            <w:tcW w:type="dxa" w:w="4680"/>
-            <w:tcBorders>
-              <w:top w:val="single" w:color="CCCCCC" w:sz="1"/>
-              <w:left w:val="single" w:color="CCCCCC" w:sz="1"/>
-              <w:bottom w:val="single" w:color="CCCCCC" w:sz="1"/>
-              <w:right w:val="single" w:color="CCCCCC" w:sz="1"/>
-            </w:tcBorders>
-            <w:shd w:fill="F5F5F5" w:val="clear"/>
-            <w:tcMar>
-              <w:top w:type="dxa" w:w="80"/>
-              <w:left w:type="dxa" w:w="120"/>
-              <w:bottom w:type="dxa" w:w="80"/>
-              <w:right w:type="dxa" w:w="120"/>
-            </w:tcMar>
-          </w:tcPr>
-          <w:p>
-            <w:r>
-              <w:rPr>
-                <w:rFonts w:ascii="Arial" w:cs="Arial" w:eastAsia="Arial" w:hAnsi="Arial"/>
-                <w:b w:val="false"/>
-                <w:bCs w:val="false"/>
-                <w:color w:val="333333"/>
-                <w:sz w:val="20"/>
-                <w:szCs w:val="20"/>
-              </w:rPr>
-              <w:t xml:space="preserve">Change speed</w:t>
-            </w:r>
-          </w:p>
-        </w:tc>
-        <w:tc>
-          <w:tcPr>
-            <w:tcW w:type="dxa" w:w="4680"/>
-            <w:tcBorders>
-              <w:top w:val="single" w:color="CCCCCC" w:sz="1"/>
-              <w:left w:val="single" w:color="CCCCCC" w:sz="1"/>
-              <w:bottom w:val="single" w:color="CCCCCC" w:sz="1"/>
-              <w:right w:val="single" w:color="CCCCCC" w:sz="1"/>
-            </w:tcBorders>
-            <w:shd w:fill="F5F5F5" w:val="clear"/>
-            <w:tcMar>
-              <w:top w:type="dxa" w:w="80"/>
-              <w:left w:type="dxa" w:w="120"/>
-              <w:bottom w:type="dxa" w:w="80"/>
-              <w:right w:type="dxa" w:w="120"/>
-            </w:tcMar>
-          </w:tcPr>
-          <w:p>
-            <w:r>
-              <w:rPr>
-                <w:rFonts w:ascii="Arial" w:cs="Arial" w:eastAsia="Arial" w:hAnsi="Arial"/>
-                <w:b w:val="false"/>
-                <w:bCs w:val="false"/>
-                <w:color w:val="333333"/>
-                <w:sz w:val="20"/>
-                <w:szCs w:val="20"/>
-              </w:rPr>
-              <w:t xml:space="preserve">Short press mode button to WPM → long press → turn knob → short press</w:t>
-            </w:r>
-          </w:p>
-        </w:tc>
-      </w:tr>
-      <w:tr>
-        <w:tc>
-          <w:tcPr>
-            <w:tcW w:type="dxa" w:w="4680"/>
-            <w:tcBorders>
-              <w:top w:val="single" w:color="CCCCCC" w:sz="1"/>
-              <w:left w:val="single" w:color="CCCCCC" w:sz="1"/>
-              <w:bottom w:val="single" w:color="CCCCCC" w:sz="1"/>
-              <w:right w:val="single" w:color="CCCCCC" w:sz="1"/>
-            </w:tcBorders>
-            <w:shd w:fill="F5F5F5" w:val="clear"/>
-            <w:tcMar>
-              <w:top w:type="dxa" w:w="80"/>
-              <w:left w:type="dxa" w:w="120"/>
-              <w:bottom w:type="dxa" w:w="80"/>
-              <w:right w:type="dxa" w:w="120"/>
-            </w:tcMar>
-          </w:tcPr>
-          <w:p>
-            <w:r>
-              <w:rPr>
-                <w:rFonts w:ascii="Arial" w:cs="Arial" w:eastAsia="Arial" w:hAnsi="Arial"/>
-                <w:b w:val="false"/>
-                <w:bCs w:val="false"/>
-                <w:color w:val="333333"/>
-                <w:sz w:val="20"/>
-                <w:szCs w:val="20"/>
-              </w:rPr>
-              <w:t xml:space="preserve">Set Farnsworth</w:t>
-            </w:r>
-          </w:p>
-        </w:tc>
-        <w:tc>
-          <w:tcPr>
-            <w:tcW w:type="dxa" w:w="4680"/>
-            <w:tcBorders>
-              <w:top w:val="single" w:color="CCCCCC" w:sz="1"/>
-              <w:left w:val="single" w:color="CCCCCC" w:sz="1"/>
-              <w:bottom w:val="single" w:color="CCCCCC" w:sz="1"/>
-              <w:right w:val="single" w:color="CCCCCC" w:sz="1"/>
-            </w:tcBorders>
-            <w:shd w:fill="F5F5F5" w:val="clear"/>
-            <w:tcMar>
-              <w:top w:type="dxa" w:w="80"/>
-              <w:left w:type="dxa" w:w="120"/>
-              <w:bottom w:type="dxa" w:w="80"/>
-              <w:right w:type="dxa" w:w="120"/>
-            </w:tcMar>
-          </w:tcPr>
-          <w:p>
-            <w:r>
-              <w:rPr>
-                <w:rFonts w:ascii="Arial" w:cs="Arial" w:eastAsia="Arial" w:hAnsi="Arial"/>
-                <w:b w:val="false"/>
-                <w:bCs w:val="false"/>
-                <w:color w:val="333333"/>
-                <w:sz w:val="20"/>
-                <w:szCs w:val="20"/>
-              </w:rPr>
-              <w:t xml:space="preserve">Long press WPM → turn knob (char speed) → short press → turn knob (gap speed) → short press</w:t>
-            </w:r>
-          </w:p>
-        </w:tc>
-      </w:tr>
-      <w:tr>
-        <w:tc>
-          <w:tcPr>
-            <w:tcW w:type="dxa" w:w="4680"/>
-            <w:tcBorders>
-              <w:top w:val="single" w:color="CCCCCC" w:sz="1"/>
-              <w:left w:val="single" w:color="CCCCCC" w:sz="1"/>
-              <w:bottom w:val="single" w:color="CCCCCC" w:sz="1"/>
-              <w:right w:val="single" w:color="CCCCCC" w:sz="1"/>
-            </w:tcBorders>
-            <w:shd w:fill="F5F5F5" w:val="clear"/>
-            <w:tcMar>
-              <w:top w:type="dxa" w:w="80"/>
-              <w:left w:type="dxa" w:w="120"/>
-              <w:bottom w:type="dxa" w:w="80"/>
-              <w:right w:type="dxa" w:w="120"/>
-            </w:tcMar>
-          </w:tcPr>
-          <w:p>
-            <w:r>
-              <w:rPr>
-                <w:rFonts w:ascii="Arial" w:cs="Arial" w:eastAsia="Arial" w:hAnsi="Arial"/>
-                <w:b w:val="false"/>
-                <w:bCs w:val="false"/>
-                <w:color w:val="333333"/>
-                <w:sz w:val="20"/>
-                <w:szCs w:val="20"/>
-              </w:rPr>
-              <w:t xml:space="preserve">Change volume</w:t>
-            </w:r>
-          </w:p>
-        </w:tc>
-        <w:tc>
-          <w:tcPr>
-            <w:tcW w:type="dxa" w:w="4680"/>
-            <w:tcBorders>
-              <w:top w:val="single" w:color="CCCCCC" w:sz="1"/>
-              <w:left w:val="single" w:color="CCCCCC" w:sz="1"/>
-              <w:bottom w:val="single" w:color="CCCCCC" w:sz="1"/>
-              <w:right w:val="single" w:color="CCCCCC" w:sz="1"/>
-            </w:tcBorders>
-            <w:shd w:fill="F5F5F5" w:val="clear"/>
-            <w:tcMar>
-              <w:top w:type="dxa" w:w="80"/>
-              <w:left w:type="dxa" w:w="120"/>
-              <w:bottom w:type="dxa" w:w="80"/>
-              <w:right w:type="dxa" w:w="120"/>
-            </w:tcMar>
-          </w:tcPr>
-          <w:p>
-            <w:r>
-              <w:rPr>
-                <w:rFonts w:ascii="Arial" w:cs="Arial" w:eastAsia="Arial" w:hAnsi="Arial"/>
-                <w:b w:val="false"/>
-                <w:bCs w:val="false"/>
-                <w:color w:val="333333"/>
-                <w:sz w:val="20"/>
-                <w:szCs w:val="20"/>
-              </w:rPr>
-              <w:t xml:space="preserve">Short press to VOL → long press → turn knob → short press</w:t>
-            </w:r>
-          </w:p>
-        </w:tc>
-      </w:tr>
-      <w:tr>
-        <w:tc>
-          <w:tcPr>
-            <w:tcW w:type="dxa" w:w="4680"/>
-            <w:tcBorders>
-              <w:top w:val="single" w:color="CCCCCC" w:sz="1"/>
-              <w:left w:val="single" w:color="CCCCCC" w:sz="1"/>
-              <w:bottom w:val="single" w:color="CCCCCC" w:sz="1"/>
-              <w:right w:val="single" w:color="CCCCCC" w:sz="1"/>
-            </w:tcBorders>
-            <w:shd w:fill="F5F5F5" w:val="clear"/>
-            <w:tcMar>
-              <w:top w:type="dxa" w:w="80"/>
-              <w:left w:type="dxa" w:w="120"/>
-              <w:bottom w:type="dxa" w:w="80"/>
-              <w:right w:type="dxa" w:w="120"/>
-            </w:tcMar>
-          </w:tcPr>
-          <w:p>
-            <w:r>
-              <w:rPr>
-                <w:rFonts w:ascii="Arial" w:cs="Arial" w:eastAsia="Arial" w:hAnsi="Arial"/>
-                <w:b w:val="false"/>
-                <w:bCs w:val="false"/>
-                <w:color w:val="333333"/>
-                <w:sz w:val="20"/>
-                <w:szCs w:val="20"/>
-              </w:rPr>
-              <w:t xml:space="preserve">Swap dit/dah</w:t>
-            </w:r>
-          </w:p>
-        </w:tc>
-        <w:tc>
-          <w:tcPr>
-            <w:tcW w:type="dxa" w:w="4680"/>
-            <w:tcBorders>
-              <w:top w:val="single" w:color="CCCCCC" w:sz="1"/>
-              <w:left w:val="single" w:color="CCCCCC" w:sz="1"/>
-              <w:bottom w:val="single" w:color="CCCCCC" w:sz="1"/>
-              <w:right w:val="single" w:color="CCCCCC" w:sz="1"/>
-            </w:tcBorders>
-            <w:shd w:fill="F5F5F5" w:val="clear"/>
-            <w:tcMar>
-              <w:top w:type="dxa" w:w="80"/>
-              <w:left w:type="dxa" w:w="120"/>
-              <w:bottom w:type="dxa" w:w="80"/>
-              <w:right w:type="dxa" w:w="120"/>
-            </w:tcMar>
-          </w:tcPr>
-          <w:p>
-            <w:r>
-              <w:rPr>
-                <w:rFonts w:ascii="Arial" w:cs="Arial" w:eastAsia="Arial" w:hAnsi="Arial"/>
-                <w:b w:val="false"/>
-                <w:bCs w:val="false"/>
-                <w:color w:val="333333"/>
-                <w:sz w:val="20"/>
-                <w:szCs w:val="20"/>
-              </w:rPr>
-              <w:t xml:space="preserve">Press paddle reverse button OR use web page swap button</w:t>
-            </w:r>
-          </w:p>
-        </w:tc>
-      </w:tr>
-      <w:tr>
-        <w:tc>
-          <w:tcPr>
-            <w:tcW w:type="dxa" w:w="4680"/>
-            <w:tcBorders>
-              <w:top w:val="single" w:color="CCCCCC" w:sz="1"/>
-              <w:left w:val="single" w:color="CCCCCC" w:sz="1"/>
-              <w:bottom w:val="single" w:color="CCCCCC" w:sz="1"/>
-              <w:right w:val="single" w:color="CCCCCC" w:sz="1"/>
-            </w:tcBorders>
-            <w:shd w:fill="F5F5F5" w:val="clear"/>
-            <w:tcMar>
-              <w:top w:type="dxa" w:w="80"/>
-              <w:left w:type="dxa" w:w="120"/>
-              <w:bottom w:type="dxa" w:w="80"/>
-              <w:right w:type="dxa" w:w="120"/>
-            </w:tcMar>
-          </w:tcPr>
-          <w:p>
-            <w:r>
-              <w:rPr>
-                <w:rFonts w:ascii="Arial" w:cs="Arial" w:eastAsia="Arial" w:hAnsi="Arial"/>
-                <w:b w:val="false"/>
-                <w:bCs w:val="false"/>
-                <w:color w:val="333333"/>
-                <w:sz w:val="20"/>
-                <w:szCs w:val="20"/>
-              </w:rPr>
-              <w:t xml:space="preserve">Connect phone</w:t>
-            </w:r>
-          </w:p>
-        </w:tc>
-        <w:tc>
-          <w:tcPr>
-            <w:tcW w:type="dxa" w:w="4680"/>
-            <w:tcBorders>
-              <w:top w:val="single" w:color="CCCCCC" w:sz="1"/>
-              <w:left w:val="single" w:color="CCCCCC" w:sz="1"/>
-              <w:bottom w:val="single" w:color="CCCCCC" w:sz="1"/>
-              <w:right w:val="single" w:color="CCCCCC" w:sz="1"/>
-            </w:tcBorders>
-            <w:shd w:fill="F5F5F5" w:val="clear"/>
-            <w:tcMar>
-              <w:top w:type="dxa" w:w="80"/>
-              <w:left w:type="dxa" w:w="120"/>
-              <w:bottom w:type="dxa" w:w="80"/>
-              <w:right w:type="dxa" w:w="120"/>
-            </w:tcMar>
-          </w:tcPr>
-          <w:p>
-            <w:r>
-              <w:rPr>
-                <w:rFonts w:ascii="Arial" w:cs="Arial" w:eastAsia="Arial" w:hAnsi="Arial"/>
-                <w:b w:val="false"/>
-                <w:bCs w:val="false"/>
-                <w:color w:val="333333"/>
-                <w:sz w:val="20"/>
-                <w:szCs w:val="20"/>
-              </w:rPr>
-              <w:t xml:space="preserve">WiFi → K0WLY-XXXX → browser → 192.168.4.1</w:t>
-            </w:r>
-          </w:p>
-        </w:tc>
-      </w:tr>
-      <w:tr>
-        <w:tc>
-          <w:tcPr>
-            <w:tcW w:type="dxa" w:w="4680"/>
-            <w:tcBorders>
-              <w:top w:val="single" w:color="CCCCCC" w:sz="1"/>
-              <w:left w:val="single" w:color="CCCCCC" w:sz="1"/>
-              <w:bottom w:val="single" w:color="CCCCCC" w:sz="1"/>
-              <w:right w:val="single" w:color="CCCCCC" w:sz="1"/>
-            </w:tcBorders>
-            <w:shd w:fill="F5F5F5" w:val="clear"/>
-            <w:tcMar>
-              <w:top w:type="dxa" w:w="80"/>
-              <w:left w:type="dxa" w:w="120"/>
-              <w:bottom w:type="dxa" w:w="80"/>
-              <w:right w:type="dxa" w:w="120"/>
-            </w:tcMar>
-          </w:tcPr>
-          <w:p>
-            <w:r>
-              <w:rPr>
-                <w:rFonts w:ascii="Arial" w:cs="Arial" w:eastAsia="Arial" w:hAnsi="Arial"/>
-                <w:b w:val="false"/>
-                <w:bCs w:val="false"/>
-                <w:color w:val="333333"/>
-                <w:sz w:val="20"/>
-                <w:szCs w:val="20"/>
-              </w:rPr>
-              <w:t xml:space="preserve">Upload practice file</w:t>
-            </w:r>
-          </w:p>
-        </w:tc>
-        <w:tc>
-          <w:tcPr>
-            <w:tcW w:type="dxa" w:w="4680"/>
-            <w:tcBorders>
-              <w:top w:val="single" w:color="CCCCCC" w:sz="1"/>
-              <w:left w:val="single" w:color="CCCCCC" w:sz="1"/>
-              <w:bottom w:val="single" w:color="CCCCCC" w:sz="1"/>
-              <w:right w:val="single" w:color="CCCCCC" w:sz="1"/>
-            </w:tcBorders>
-            <w:shd w:fill="F5F5F5" w:val="clear"/>
-            <w:tcMar>
-              <w:top w:type="dxa" w:w="80"/>
-              <w:left w:type="dxa" w:w="120"/>
-              <w:bottom w:type="dxa" w:w="80"/>
-              <w:right w:type="dxa" w:w="120"/>
-            </w:tcMar>
-          </w:tcPr>
-          <w:p>
-            <w:r>
-              <w:rPr>
-                <w:rFonts w:ascii="Arial" w:cs="Arial" w:eastAsia="Arial" w:hAnsi="Arial"/>
-                <w:b w:val="false"/>
-                <w:bCs w:val="false"/>
-                <w:color w:val="333333"/>
-                <w:sz w:val="20"/>
-                <w:szCs w:val="20"/>
-              </w:rPr>
-              <w:t xml:space="preserve">Connect phone → web page → Upload Text File</w:t>
-            </w:r>
-          </w:p>
-        </w:tc>
-      </w:tr>
-      <w:tr>
-        <w:tc>
-          <w:tcPr>
-            <w:tcW w:type="dxa" w:w="4680"/>
-            <w:tcBorders>
-              <w:top w:val="single" w:color="CCCCCC" w:sz="1"/>
-              <w:left w:val="single" w:color="CCCCCC" w:sz="1"/>
-              <w:bottom w:val="single" w:color="CCCCCC" w:sz="1"/>
-              <w:right w:val="single" w:color="CCCCCC" w:sz="1"/>
-            </w:tcBorders>
-            <w:shd w:fill="F5F5F5" w:val="clear"/>
-            <w:tcMar>
-              <w:top w:type="dxa" w:w="80"/>
-              <w:left w:type="dxa" w:w="120"/>
-              <w:bottom w:type="dxa" w:w="80"/>
-              <w:right w:type="dxa" w:w="120"/>
-            </w:tcMar>
-          </w:tcPr>
-          <w:p>
-            <w:r>
-              <w:rPr>
-                <w:rFonts w:ascii="Arial" w:cs="Arial" w:eastAsia="Arial" w:hAnsi="Arial"/>
-                <w:b w:val="false"/>
-                <w:bCs w:val="false"/>
-                <w:color w:val="333333"/>
-                <w:sz w:val="20"/>
-                <w:szCs w:val="20"/>
-              </w:rPr>
-              <w:t xml:space="preserve">Play a file</w:t>
-            </w:r>
-          </w:p>
-        </w:tc>
-        <w:tc>
-          <w:tcPr>
-            <w:tcW w:type="dxa" w:w="4680"/>
-            <w:tcBorders>
-              <w:top w:val="single" w:color="CCCCCC" w:sz="1"/>
-              <w:left w:val="single" w:color="CCCCCC" w:sz="1"/>
-              <w:bottom w:val="single" w:color="CCCCCC" w:sz="1"/>
-              <w:right w:val="single" w:color="CCCCCC" w:sz="1"/>
-            </w:tcBorders>
-            <w:shd w:fill="F5F5F5" w:val="clear"/>
-            <w:tcMar>
-              <w:top w:type="dxa" w:w="80"/>
-              <w:left w:type="dxa" w:w="120"/>
-              <w:bottom w:type="dxa" w:w="80"/>
-              <w:right w:type="dxa" w:w="120"/>
-            </w:tcMar>
-          </w:tcPr>
-          <w:p>
-            <w:r>
-              <w:rPr>
-                <w:rFonts w:ascii="Arial" w:cs="Arial" w:eastAsia="Arial" w:hAnsi="Arial"/>
-                <w:b w:val="false"/>
-                <w:bCs w:val="false"/>
-                <w:color w:val="333333"/>
-                <w:sz w:val="20"/>
-                <w:szCs w:val="20"/>
-              </w:rPr>
-              <w:t xml:space="preserve">Connect phone → web page → tap ▶ next to file name</w:t>
-            </w:r>
-          </w:p>
-        </w:tc>
-      </w:tr>
-      <w:tr>
-        <w:tc>
-          <w:tcPr>
-            <w:tcW w:type="dxa" w:w="4680"/>
-            <w:tcBorders>
-              <w:top w:val="single" w:color="CCCCCC" w:sz="1"/>
-              <w:left w:val="single" w:color="CCCCCC" w:sz="1"/>
-              <w:bottom w:val="single" w:color="CCCCCC" w:sz="1"/>
-              <w:right w:val="single" w:color="CCCCCC" w:sz="1"/>
-            </w:tcBorders>
-            <w:shd w:fill="F5F5F5" w:val="clear"/>
-            <w:tcMar>
-              <w:top w:type="dxa" w:w="80"/>
-              <w:left w:type="dxa" w:w="120"/>
-              <w:bottom w:type="dxa" w:w="80"/>
-              <w:right w:type="dxa" w:w="120"/>
-            </w:tcMar>
-          </w:tcPr>
-          <w:p>
-            <w:r>
-              <w:rPr>
-                <w:rFonts w:ascii="Arial" w:cs="Arial" w:eastAsia="Arial" w:hAnsi="Arial"/>
-                <w:b w:val="false"/>
-                <w:bCs w:val="false"/>
-                <w:color w:val="333333"/>
-                <w:sz w:val="20"/>
-                <w:szCs w:val="20"/>
-              </w:rPr>
-              <w:t xml:space="preserve">Pause playback</w:t>
-            </w:r>
-          </w:p>
-        </w:tc>
-        <w:tc>
-          <w:tcPr>
-            <w:tcW w:type="dxa" w:w="4680"/>
-            <w:tcBorders>
-              <w:top w:val="single" w:color="CCCCCC" w:sz="1"/>
-              <w:left w:val="single" w:color="CCCCCC" w:sz="1"/>
-              <w:bottom w:val="single" w:color="CCCCCC" w:sz="1"/>
-              <w:right w:val="single" w:color="CCCCCC" w:sz="1"/>
-            </w:tcBorders>
-            <w:shd w:fill="F5F5F5" w:val="clear"/>
-            <w:tcMar>
-              <w:top w:type="dxa" w:w="80"/>
-              <w:left w:type="dxa" w:w="120"/>
-              <w:bottom w:type="dxa" w:w="80"/>
-              <w:right w:type="dxa" w:w="120"/>
-            </w:tcMar>
-          </w:tcPr>
-          <w:p>
-            <w:r>
-              <w:rPr>
-                <w:rFonts w:ascii="Arial" w:cs="Arial" w:eastAsia="Arial" w:hAnsi="Arial"/>
-                <w:b w:val="false"/>
-                <w:bCs w:val="false"/>
-                <w:color w:val="333333"/>
-                <w:sz w:val="20"/>
-                <w:szCs w:val="20"/>
-              </w:rPr>
-              <w:t xml:space="preserve">Web page → Pause/Resume button</w:t>
-            </w:r>
-          </w:p>
-        </w:tc>
-      </w:tr>
-      <w:tr>
-        <w:tc>
-          <w:tcPr>
-            <w:tcW w:type="dxa" w:w="4680"/>
-            <w:tcBorders>
-              <w:top w:val="single" w:color="CCCCCC" w:sz="1"/>
-              <w:left w:val="single" w:color="CCCCCC" w:sz="1"/>
-              <w:bottom w:val="single" w:color="CCCCCC" w:sz="1"/>
-              <w:right w:val="single" w:color="CCCCCC" w:sz="1"/>
-            </w:tcBorders>
-            <w:shd w:fill="F5F5F5" w:val="clear"/>
-            <w:tcMar>
-              <w:top w:type="dxa" w:w="80"/>
-              <w:left w:type="dxa" w:w="120"/>
-              <w:bottom w:type="dxa" w:w="80"/>
-              <w:right w:type="dxa" w:w="120"/>
-            </w:tcMar>
-          </w:tcPr>
-          <w:p>
-            <w:r>
-              <w:rPr>
-                <w:rFonts w:ascii="Arial" w:cs="Arial" w:eastAsia="Arial" w:hAnsi="Arial"/>
-                <w:b w:val="false"/>
-                <w:bCs w:val="false"/>
-                <w:color w:val="333333"/>
-                <w:sz w:val="20"/>
-                <w:szCs w:val="20"/>
-              </w:rPr>
-              <w:t xml:space="preserve">Stop playback</w:t>
-            </w:r>
-          </w:p>
-        </w:tc>
-        <w:tc>
-          <w:tcPr>
-            <w:tcW w:type="dxa" w:w="4680"/>
-            <w:tcBorders>
-              <w:top w:val="single" w:color="CCCCCC" w:sz="1"/>
-              <w:left w:val="single" w:color="CCCCCC" w:sz="1"/>
-              <w:bottom w:val="single" w:color="CCCCCC" w:sz="1"/>
-              <w:right w:val="single" w:color="CCCCCC" w:sz="1"/>
-            </w:tcBorders>
-            <w:shd w:fill="F5F5F5" w:val="clear"/>
-            <w:tcMar>
-              <w:top w:type="dxa" w:w="80"/>
-              <w:left w:type="dxa" w:w="120"/>
-              <w:bottom w:type="dxa" w:w="80"/>
-              <w:right w:type="dxa" w:w="120"/>
-            </w:tcMar>
-          </w:tcPr>
-          <w:p>
-            <w:r>
-              <w:rPr>
-                <w:rFonts w:ascii="Arial" w:cs="Arial" w:eastAsia="Arial" w:hAnsi="Arial"/>
-                <w:b w:val="false"/>
-                <w:bCs w:val="false"/>
-                <w:color w:val="333333"/>
-                <w:sz w:val="20"/>
-                <w:szCs w:val="20"/>
-              </w:rPr>
-              <w:t xml:space="preserve">Web page → Stop Playback button</w:t>
-            </w:r>
-          </w:p>
-        </w:tc>
-      </w:tr>
-      <w:tr>
-        <w:tc>
-          <w:tcPr>
-            <w:tcW w:type="dxa" w:w="4680"/>
-            <w:tcBorders>
-              <w:top w:val="single" w:color="CCCCCC" w:sz="1"/>
-              <w:left w:val="single" w:color="CCCCCC" w:sz="1"/>
-              <w:bottom w:val="single" w:color="CCCCCC" w:sz="1"/>
-              <w:right w:val="single" w:color="CCCCCC" w:sz="1"/>
-            </w:tcBorders>
-            <w:shd w:fill="F5F5F5" w:val="clear"/>
-            <w:tcMar>
-              <w:top w:type="dxa" w:w="80"/>
-              <w:left w:type="dxa" w:w="120"/>
-              <w:bottom w:type="dxa" w:w="80"/>
-              <w:right w:type="dxa" w:w="120"/>
-            </w:tcMar>
-          </w:tcPr>
-          <w:p>
-            <w:r>
-              <w:rPr>
-                <w:rFonts w:ascii="Arial" w:cs="Arial" w:eastAsia="Arial" w:hAnsi="Arial"/>
-                <w:b w:val="false"/>
-                <w:bCs w:val="false"/>
-                <w:color w:val="333333"/>
-                <w:sz w:val="20"/>
-                <w:szCs w:val="20"/>
-              </w:rPr>
-              <w:t xml:space="preserve">Enable Audio Only</w:t>
-            </w:r>
-          </w:p>
-        </w:tc>
-        <w:tc>
-          <w:tcPr>
-            <w:tcW w:type="dxa" w:w="4680"/>
-            <w:tcBorders>
-              <w:top w:val="single" w:color="CCCCCC" w:sz="1"/>
-              <w:left w:val="single" w:color="CCCCCC" w:sz="1"/>
-              <w:bottom w:val="single" w:color="CCCCCC" w:sz="1"/>
-              <w:right w:val="single" w:color="CCCCCC" w:sz="1"/>
-            </w:tcBorders>
-            <w:shd w:fill="F5F5F5" w:val="clear"/>
-            <w:tcMar>
-              <w:top w:type="dxa" w:w="80"/>
-              <w:left w:type="dxa" w:w="120"/>
-              <w:bottom w:type="dxa" w:w="80"/>
-              <w:right w:type="dxa" w:w="120"/>
-            </w:tcMar>
-          </w:tcPr>
-          <w:p>
-            <w:r>
-              <w:rPr>
-                <w:rFonts w:ascii="Arial" w:cs="Arial" w:eastAsia="Arial" w:hAnsi="Arial"/>
-                <w:b w:val="false"/>
-                <w:bCs w:val="false"/>
-                <w:color w:val="333333"/>
-                <w:sz w:val="20"/>
-                <w:szCs w:val="20"/>
-              </w:rPr>
-              <w:t xml:space="preserve">Short press to DELAY → long press → turn knob to maximum → short press</w:t>
-            </w:r>
-          </w:p>
-        </w:tc>
-      </w:tr>
-      <w:tr>
-        <w:tc>
-          <w:tcPr>
-            <w:tcW w:type="dxa" w:w="4680"/>
-            <w:tcBorders>
-              <w:top w:val="single" w:color="CCCCCC" w:sz="1"/>
-              <w:left w:val="single" w:color="CCCCCC" w:sz="1"/>
-              <w:bottom w:val="single" w:color="CCCCCC" w:sz="1"/>
-              <w:right w:val="single" w:color="CCCCCC" w:sz="1"/>
-            </w:tcBorders>
-            <w:shd w:fill="F5F5F5" w:val="clear"/>
-            <w:tcMar>
-              <w:top w:type="dxa" w:w="80"/>
-              <w:left w:type="dxa" w:w="120"/>
-              <w:bottom w:type="dxa" w:w="80"/>
-              <w:right w:type="dxa" w:w="120"/>
-            </w:tcMar>
-          </w:tcPr>
-          <w:p>
-            <w:r>
-              <w:rPr>
-                <w:rFonts w:ascii="Arial" w:cs="Arial" w:eastAsia="Arial" w:hAnsi="Arial"/>
-                <w:b w:val="false"/>
-                <w:bCs w:val="false"/>
-                <w:color w:val="333333"/>
-                <w:sz w:val="20"/>
-                <w:szCs w:val="20"/>
-              </w:rPr>
-              <w:t xml:space="preserve">Connect two units</w:t>
-            </w:r>
-          </w:p>
-        </w:tc>
-        <w:tc>
-          <w:tcPr>
-            <w:tcW w:type="dxa" w:w="4680"/>
-            <w:tcBorders>
-              <w:top w:val="single" w:color="CCCCCC" w:sz="1"/>
-              <w:left w:val="single" w:color="CCCCCC" w:sz="1"/>
-              <w:bottom w:val="single" w:color="CCCCCC" w:sz="1"/>
-              <w:right w:val="single" w:color="CCCCCC" w:sz="1"/>
-            </w:tcBorders>
-            <w:shd w:fill="F5F5F5" w:val="clear"/>
-            <w:tcMar>
-              <w:top w:type="dxa" w:w="80"/>
-              <w:left w:type="dxa" w:w="120"/>
-              <w:bottom w:type="dxa" w:w="80"/>
-              <w:right w:type="dxa" w:w="120"/>
-            </w:tcMar>
-          </w:tcPr>
-          <w:p>
-            <w:r>
-              <w:rPr>
-                <w:rFonts w:ascii="Arial" w:cs="Arial" w:eastAsia="Arial" w:hAnsi="Arial"/>
-                <w:b w:val="false"/>
-                <w:bCs w:val="false"/>
-                <w:color w:val="333333"/>
-                <w:sz w:val="20"/>
-                <w:szCs w:val="20"/>
-              </w:rPr>
-              <w:t xml:space="preserve">Power on both — they find each other automatically</w:t>
-            </w:r>
-          </w:p>
-        </w:tc>
-      </w:tr>
-    </w:tbl>
-    <w:p>
-      <w:pPr>
-        <w:spacing w:after="120"/>
-      </w:pPr>
-      <w:r>
-        <w:t xml:space="preserve"/>
-      </w:r>
-    </w:p>
-    <w:p>
-      <w:pPr>
-        <w:pBdr>
-          <w:top w:val="single" w:color="2E4057" w:sz="6" w:space="1"/>
-        </w:pBdr>
-        <w:spacing w:before="720"/>
-        <w:jc w:val="center"/>
-      </w:pPr>
-      <w:r>
-        <w:rPr>
-          <w:rFonts w:ascii="Arial" w:cs="Arial" w:eastAsia="Arial" w:hAnsi="Arial"/>
-          <w:i/>
-          <w:iCs/>
-          <w:color w:val="666666"/>
-          <w:sz w:val="18"/>
-          <w:szCs w:val="18"/>
-        </w:rPr>
-        <w:t xml:space="preserve">K0WLY Two-Way CW Keyer — User Guide v1.4.3</w:t>
-      </w:r>
-    </w:p>
-    <w:p>
-      <w:pPr>
-        <w:spacing w:after="120"/>
+        <w:spacing w:before="480"/>
         <w:jc w:val="center"/>
       </w:pPr>
       <w:r>
@@ -7351,7 +6018,7 @@
           <w:sz w:val="18"/>
           <w:szCs w:val="18"/>
         </w:rPr>
-        <w:t xml:space="preserve">Copyright © 2026 K0WLY (Carl Cowley) — CC BY 4.0 — 73 de K0WLY</w:t>
+        <w:t xml:space="preserve">K0WLY Two-Way CW Keyer — User Guide v1.4.4 — 73 de K0WLY</w:t>
       </w:r>
     </w:p>
     <w:sectPr>
@@ -7424,7 +6091,7 @@
         <w:sz w:val="14"/>
         <w:szCs w:val="14"/>
       </w:rPr>
-      <w:t xml:space="preserve">K0WLY Two-Way CW Keyer — User Guide — Copyright © 2026 K0WLY (Carl Cowley) — CC BY 4.0</w:t>
+      <w:t xml:space="preserve">K0WLY Two-Way CW Keyer — User Guide v1.4.4 — Copyright © 2026 K0WLY — CERN-OHL-W v2 / CC BY 4.0</w:t>
     </w:r>
   </w:p>
 </w:ftr>

</xml_diff>